<commit_message>
Update project documentation and presentation
</commit_message>
<xml_diff>
--- a/docs/deliverables/PhishGuard_Organized_Project_Documentation.docx
+++ b/docs/deliverables/PhishGuard_Organized_Project_Documentation.docx
@@ -441,7 +441,7 @@
       <w:pPr>
         <w:pStyle w:val="Heading1"/>
       </w:pPr>
-      <w:bookmarkStart w:id="0" w:name="_Toc234178910"/>
+      <w:bookmarkStart w:id="0" w:name="_Toc234413340"/>
       <w:r>
         <w:lastRenderedPageBreak/>
         <w:t>Index &amp; Document Navigation</w:t>
@@ -511,7 +511,7 @@
       <w:pPr>
         <w:pStyle w:val="Heading2"/>
       </w:pPr>
-      <w:bookmarkStart w:id="1" w:name="_Toc234178911"/>
+      <w:bookmarkStart w:id="1" w:name="_Toc234413341"/>
       <w:r>
         <w:t>Table of Contents</w:t>
       </w:r>
@@ -547,7 +547,7 @@
       <w:r>
         <w:fldChar w:fldCharType="separate"/>
       </w:r>
-      <w:hyperlink w:anchor="_Toc234178910" w:history="1">
+      <w:hyperlink w:anchor="_Toc234413340" w:history="1">
         <w:r>
           <w:rPr>
             <w:rStyle w:val="Hyperlink"/>
@@ -574,7 +574,7 @@
             <w:noProof/>
             <w:webHidden/>
           </w:rPr>
-          <w:instrText xml:space="preserve"> PAGEREF _Toc234178910 \h </w:instrText>
+          <w:instrText xml:space="preserve"> PAGEREF _Toc234413340 \h </w:instrText>
         </w:r>
         <w:r>
           <w:rPr>
@@ -621,7 +621,7 @@
           <w14:ligatures w14:val="standardContextual"/>
         </w:rPr>
       </w:pPr>
-      <w:hyperlink w:anchor="_Toc234178911" w:history="1">
+      <w:hyperlink w:anchor="_Toc234413341" w:history="1">
         <w:r>
           <w:rPr>
             <w:rStyle w:val="Hyperlink"/>
@@ -648,7 +648,7 @@
             <w:noProof/>
             <w:webHidden/>
           </w:rPr>
-          <w:instrText xml:space="preserve"> PAGEREF _Toc234178911 \h </w:instrText>
+          <w:instrText xml:space="preserve"> PAGEREF _Toc234413341 \h </w:instrText>
         </w:r>
         <w:r>
           <w:rPr>
@@ -695,7 +695,7 @@
           <w14:ligatures w14:val="standardContextual"/>
         </w:rPr>
       </w:pPr>
-      <w:hyperlink w:anchor="_Toc234178912" w:history="1">
+      <w:hyperlink w:anchor="_Toc234413342" w:history="1">
         <w:r>
           <w:rPr>
             <w:rStyle w:val="Hyperlink"/>
@@ -722,7 +722,7 @@
             <w:noProof/>
             <w:webHidden/>
           </w:rPr>
-          <w:instrText xml:space="preserve"> PAGEREF _Toc234178912 \h </w:instrText>
+          <w:instrText xml:space="preserve"> PAGEREF _Toc234413342 \h </w:instrText>
         </w:r>
         <w:r>
           <w:rPr>
@@ -769,7 +769,7 @@
           <w14:ligatures w14:val="standardContextual"/>
         </w:rPr>
       </w:pPr>
-      <w:hyperlink w:anchor="_Toc234178913" w:history="1">
+      <w:hyperlink w:anchor="_Toc234413343" w:history="1">
         <w:r>
           <w:rPr>
             <w:rStyle w:val="Hyperlink"/>
@@ -796,7 +796,7 @@
             <w:noProof/>
             <w:webHidden/>
           </w:rPr>
-          <w:instrText xml:space="preserve"> PAGEREF _Toc234178913 \h </w:instrText>
+          <w:instrText xml:space="preserve"> PAGEREF _Toc234413343 \h </w:instrText>
         </w:r>
         <w:r>
           <w:rPr>
@@ -843,7 +843,7 @@
           <w14:ligatures w14:val="standardContextual"/>
         </w:rPr>
       </w:pPr>
-      <w:hyperlink w:anchor="_Toc234178914" w:history="1">
+      <w:hyperlink w:anchor="_Toc234413344" w:history="1">
         <w:r>
           <w:rPr>
             <w:rStyle w:val="Hyperlink"/>
@@ -870,7 +870,7 @@
             <w:noProof/>
             <w:webHidden/>
           </w:rPr>
-          <w:instrText xml:space="preserve"> PAGEREF _Toc234178914 \h </w:instrText>
+          <w:instrText xml:space="preserve"> PAGEREF _Toc234413344 \h </w:instrText>
         </w:r>
         <w:r>
           <w:rPr>
@@ -917,7 +917,7 @@
           <w14:ligatures w14:val="standardContextual"/>
         </w:rPr>
       </w:pPr>
-      <w:hyperlink w:anchor="_Toc234178915" w:history="1">
+      <w:hyperlink w:anchor="_Toc234413345" w:history="1">
         <w:r>
           <w:rPr>
             <w:rStyle w:val="Hyperlink"/>
@@ -944,7 +944,7 @@
             <w:noProof/>
             <w:webHidden/>
           </w:rPr>
-          <w:instrText xml:space="preserve"> PAGEREF _Toc234178915 \h </w:instrText>
+          <w:instrText xml:space="preserve"> PAGEREF _Toc234413345 \h </w:instrText>
         </w:r>
         <w:r>
           <w:rPr>
@@ -991,7 +991,7 @@
           <w14:ligatures w14:val="standardContextual"/>
         </w:rPr>
       </w:pPr>
-      <w:hyperlink w:anchor="_Toc234178916" w:history="1">
+      <w:hyperlink w:anchor="_Toc234413346" w:history="1">
         <w:r>
           <w:rPr>
             <w:rStyle w:val="Hyperlink"/>
@@ -1018,7 +1018,7 @@
             <w:noProof/>
             <w:webHidden/>
           </w:rPr>
-          <w:instrText xml:space="preserve"> PAGEREF _Toc234178916 \h </w:instrText>
+          <w:instrText xml:space="preserve"> PAGEREF _Toc234413346 \h </w:instrText>
         </w:r>
         <w:r>
           <w:rPr>
@@ -1065,7 +1065,7 @@
           <w14:ligatures w14:val="standardContextual"/>
         </w:rPr>
       </w:pPr>
-      <w:hyperlink w:anchor="_Toc234178917" w:history="1">
+      <w:hyperlink w:anchor="_Toc234413347" w:history="1">
         <w:r>
           <w:rPr>
             <w:rStyle w:val="Hyperlink"/>
@@ -1092,7 +1092,7 @@
             <w:noProof/>
             <w:webHidden/>
           </w:rPr>
-          <w:instrText xml:space="preserve"> PAGEREF _Toc234178917 \h </w:instrText>
+          <w:instrText xml:space="preserve"> PAGEREF _Toc234413347 \h </w:instrText>
         </w:r>
         <w:r>
           <w:rPr>
@@ -1139,7 +1139,7 @@
           <w14:ligatures w14:val="standardContextual"/>
         </w:rPr>
       </w:pPr>
-      <w:hyperlink w:anchor="_Toc234178918" w:history="1">
+      <w:hyperlink w:anchor="_Toc234413348" w:history="1">
         <w:r>
           <w:rPr>
             <w:rStyle w:val="Hyperlink"/>
@@ -1166,7 +1166,7 @@
             <w:noProof/>
             <w:webHidden/>
           </w:rPr>
-          <w:instrText xml:space="preserve"> PAGEREF _Toc234178918 \h </w:instrText>
+          <w:instrText xml:space="preserve"> PAGEREF _Toc234413348 \h </w:instrText>
         </w:r>
         <w:r>
           <w:rPr>
@@ -1213,7 +1213,7 @@
           <w14:ligatures w14:val="standardContextual"/>
         </w:rPr>
       </w:pPr>
-      <w:hyperlink w:anchor="_Toc234178919" w:history="1">
+      <w:hyperlink w:anchor="_Toc234413349" w:history="1">
         <w:r>
           <w:rPr>
             <w:rStyle w:val="Hyperlink"/>
@@ -1240,7 +1240,7 @@
             <w:noProof/>
             <w:webHidden/>
           </w:rPr>
-          <w:instrText xml:space="preserve"> PAGEREF _Toc234178919 \h </w:instrText>
+          <w:instrText xml:space="preserve"> PAGEREF _Toc234413349 \h </w:instrText>
         </w:r>
         <w:r>
           <w:rPr>
@@ -1287,7 +1287,7 @@
           <w14:ligatures w14:val="standardContextual"/>
         </w:rPr>
       </w:pPr>
-      <w:hyperlink w:anchor="_Toc234178920" w:history="1">
+      <w:hyperlink w:anchor="_Toc234413350" w:history="1">
         <w:r>
           <w:rPr>
             <w:rStyle w:val="Hyperlink"/>
@@ -1314,7 +1314,7 @@
             <w:noProof/>
             <w:webHidden/>
           </w:rPr>
-          <w:instrText xml:space="preserve"> PAGEREF _Toc234178920 \h </w:instrText>
+          <w:instrText xml:space="preserve"> PAGEREF _Toc234413350 \h </w:instrText>
         </w:r>
         <w:r>
           <w:rPr>
@@ -1361,7 +1361,7 @@
           <w14:ligatures w14:val="standardContextual"/>
         </w:rPr>
       </w:pPr>
-      <w:hyperlink w:anchor="_Toc234178921" w:history="1">
+      <w:hyperlink w:anchor="_Toc234413351" w:history="1">
         <w:r>
           <w:rPr>
             <w:rStyle w:val="Hyperlink"/>
@@ -1388,7 +1388,7 @@
             <w:noProof/>
             <w:webHidden/>
           </w:rPr>
-          <w:instrText xml:space="preserve"> PAGEREF _Toc234178921 \h </w:instrText>
+          <w:instrText xml:space="preserve"> PAGEREF _Toc234413351 \h </w:instrText>
         </w:r>
         <w:r>
           <w:rPr>
@@ -1435,7 +1435,7 @@
           <w14:ligatures w14:val="standardContextual"/>
         </w:rPr>
       </w:pPr>
-      <w:hyperlink w:anchor="_Toc234178922" w:history="1">
+      <w:hyperlink w:anchor="_Toc234413352" w:history="1">
         <w:r>
           <w:rPr>
             <w:rStyle w:val="Hyperlink"/>
@@ -1462,7 +1462,7 @@
             <w:noProof/>
             <w:webHidden/>
           </w:rPr>
-          <w:instrText xml:space="preserve"> PAGEREF _Toc234178922 \h </w:instrText>
+          <w:instrText xml:space="preserve"> PAGEREF _Toc234413352 \h </w:instrText>
         </w:r>
         <w:r>
           <w:rPr>
@@ -1509,7 +1509,7 @@
           <w14:ligatures w14:val="standardContextual"/>
         </w:rPr>
       </w:pPr>
-      <w:hyperlink w:anchor="_Toc234178923" w:history="1">
+      <w:hyperlink w:anchor="_Toc234413353" w:history="1">
         <w:r>
           <w:rPr>
             <w:rStyle w:val="Hyperlink"/>
@@ -1536,7 +1536,7 @@
             <w:noProof/>
             <w:webHidden/>
           </w:rPr>
-          <w:instrText xml:space="preserve"> PAGEREF _Toc234178923 \h </w:instrText>
+          <w:instrText xml:space="preserve"> PAGEREF _Toc234413353 \h </w:instrText>
         </w:r>
         <w:r>
           <w:rPr>
@@ -1583,7 +1583,7 @@
           <w14:ligatures w14:val="standardContextual"/>
         </w:rPr>
       </w:pPr>
-      <w:hyperlink w:anchor="_Toc234178924" w:history="1">
+      <w:hyperlink w:anchor="_Toc234413354" w:history="1">
         <w:r>
           <w:rPr>
             <w:rStyle w:val="Hyperlink"/>
@@ -1610,7 +1610,7 @@
             <w:noProof/>
             <w:webHidden/>
           </w:rPr>
-          <w:instrText xml:space="preserve"> PAGEREF _Toc234178924 \h </w:instrText>
+          <w:instrText xml:space="preserve"> PAGEREF _Toc234413354 \h </w:instrText>
         </w:r>
         <w:r>
           <w:rPr>
@@ -1657,7 +1657,7 @@
           <w14:ligatures w14:val="standardContextual"/>
         </w:rPr>
       </w:pPr>
-      <w:hyperlink w:anchor="_Toc234178925" w:history="1">
+      <w:hyperlink w:anchor="_Toc234413355" w:history="1">
         <w:r>
           <w:rPr>
             <w:rStyle w:val="Hyperlink"/>
@@ -1684,7 +1684,7 @@
             <w:noProof/>
             <w:webHidden/>
           </w:rPr>
-          <w:instrText xml:space="preserve"> PAGEREF _Toc234178925 \h </w:instrText>
+          <w:instrText xml:space="preserve"> PAGEREF _Toc234413355 \h </w:instrText>
         </w:r>
         <w:r>
           <w:rPr>
@@ -1731,7 +1731,7 @@
           <w14:ligatures w14:val="standardContextual"/>
         </w:rPr>
       </w:pPr>
-      <w:hyperlink w:anchor="_Toc234178926" w:history="1">
+      <w:hyperlink w:anchor="_Toc234413356" w:history="1">
         <w:r>
           <w:rPr>
             <w:rStyle w:val="Hyperlink"/>
@@ -1758,7 +1758,7 @@
             <w:noProof/>
             <w:webHidden/>
           </w:rPr>
-          <w:instrText xml:space="preserve"> PAGEREF _Toc234178926 \h </w:instrText>
+          <w:instrText xml:space="preserve"> PAGEREF _Toc234413356 \h </w:instrText>
         </w:r>
         <w:r>
           <w:rPr>
@@ -1805,7 +1805,7 @@
           <w14:ligatures w14:val="standardContextual"/>
         </w:rPr>
       </w:pPr>
-      <w:hyperlink w:anchor="_Toc234178927" w:history="1">
+      <w:hyperlink w:anchor="_Toc234413357" w:history="1">
         <w:r>
           <w:rPr>
             <w:rStyle w:val="Hyperlink"/>
@@ -1832,7 +1832,7 @@
             <w:noProof/>
             <w:webHidden/>
           </w:rPr>
-          <w:instrText xml:space="preserve"> PAGEREF _Toc234178927 \h </w:instrText>
+          <w:instrText xml:space="preserve"> PAGEREF _Toc234413357 \h </w:instrText>
         </w:r>
         <w:r>
           <w:rPr>
@@ -1879,7 +1879,7 @@
           <w14:ligatures w14:val="standardContextual"/>
         </w:rPr>
       </w:pPr>
-      <w:hyperlink w:anchor="_Toc234178928" w:history="1">
+      <w:hyperlink w:anchor="_Toc234413358" w:history="1">
         <w:r>
           <w:rPr>
             <w:rStyle w:val="Hyperlink"/>
@@ -1906,7 +1906,7 @@
             <w:noProof/>
             <w:webHidden/>
           </w:rPr>
-          <w:instrText xml:space="preserve"> PAGEREF _Toc234178928 \h </w:instrText>
+          <w:instrText xml:space="preserve"> PAGEREF _Toc234413358 \h </w:instrText>
         </w:r>
         <w:r>
           <w:rPr>
@@ -1953,7 +1953,7 @@
           <w14:ligatures w14:val="standardContextual"/>
         </w:rPr>
       </w:pPr>
-      <w:hyperlink w:anchor="_Toc234178929" w:history="1">
+      <w:hyperlink w:anchor="_Toc234413359" w:history="1">
         <w:r>
           <w:rPr>
             <w:rStyle w:val="Hyperlink"/>
@@ -1980,7 +1980,7 @@
             <w:noProof/>
             <w:webHidden/>
           </w:rPr>
-          <w:instrText xml:space="preserve"> PAGEREF _Toc234178929 \h </w:instrText>
+          <w:instrText xml:space="preserve"> PAGEREF _Toc234413359 \h </w:instrText>
         </w:r>
         <w:r>
           <w:rPr>
@@ -2027,7 +2027,7 @@
           <w14:ligatures w14:val="standardContextual"/>
         </w:rPr>
       </w:pPr>
-      <w:hyperlink w:anchor="_Toc234178930" w:history="1">
+      <w:hyperlink w:anchor="_Toc234413360" w:history="1">
         <w:r>
           <w:rPr>
             <w:rStyle w:val="Hyperlink"/>
@@ -2054,7 +2054,7 @@
             <w:noProof/>
             <w:webHidden/>
           </w:rPr>
-          <w:instrText xml:space="preserve"> PAGEREF _Toc234178930 \h </w:instrText>
+          <w:instrText xml:space="preserve"> PAGEREF _Toc234413360 \h </w:instrText>
         </w:r>
         <w:r>
           <w:rPr>
@@ -2101,7 +2101,7 @@
           <w14:ligatures w14:val="standardContextual"/>
         </w:rPr>
       </w:pPr>
-      <w:hyperlink w:anchor="_Toc234178931" w:history="1">
+      <w:hyperlink w:anchor="_Toc234413361" w:history="1">
         <w:r>
           <w:rPr>
             <w:rStyle w:val="Hyperlink"/>
@@ -2128,7 +2128,7 @@
             <w:noProof/>
             <w:webHidden/>
           </w:rPr>
-          <w:instrText xml:space="preserve"> PAGEREF _Toc234178931 \h </w:instrText>
+          <w:instrText xml:space="preserve"> PAGEREF _Toc234413361 \h </w:instrText>
         </w:r>
         <w:r>
           <w:rPr>
@@ -2175,7 +2175,7 @@
           <w14:ligatures w14:val="standardContextual"/>
         </w:rPr>
       </w:pPr>
-      <w:hyperlink w:anchor="_Toc234178932" w:history="1">
+      <w:hyperlink w:anchor="_Toc234413362" w:history="1">
         <w:r>
           <w:rPr>
             <w:rStyle w:val="Hyperlink"/>
@@ -2202,7 +2202,7 @@
             <w:noProof/>
             <w:webHidden/>
           </w:rPr>
-          <w:instrText xml:space="preserve"> PAGEREF _Toc234178932 \h </w:instrText>
+          <w:instrText xml:space="preserve"> PAGEREF _Toc234413362 \h </w:instrText>
         </w:r>
         <w:r>
           <w:rPr>
@@ -2249,7 +2249,7 @@
           <w14:ligatures w14:val="standardContextual"/>
         </w:rPr>
       </w:pPr>
-      <w:hyperlink w:anchor="_Toc234178933" w:history="1">
+      <w:hyperlink w:anchor="_Toc234413363" w:history="1">
         <w:r>
           <w:rPr>
             <w:rStyle w:val="Hyperlink"/>
@@ -2276,7 +2276,7 @@
             <w:noProof/>
             <w:webHidden/>
           </w:rPr>
-          <w:instrText xml:space="preserve"> PAGEREF _Toc234178933 \h </w:instrText>
+          <w:instrText xml:space="preserve"> PAGEREF _Toc234413363 \h </w:instrText>
         </w:r>
         <w:r>
           <w:rPr>
@@ -2323,7 +2323,7 @@
           <w14:ligatures w14:val="standardContextual"/>
         </w:rPr>
       </w:pPr>
-      <w:hyperlink w:anchor="_Toc234178934" w:history="1">
+      <w:hyperlink w:anchor="_Toc234413364" w:history="1">
         <w:r>
           <w:rPr>
             <w:rStyle w:val="Hyperlink"/>
@@ -2350,7 +2350,7 @@
             <w:noProof/>
             <w:webHidden/>
           </w:rPr>
-          <w:instrText xml:space="preserve"> PAGEREF _Toc234178934 \h </w:instrText>
+          <w:instrText xml:space="preserve"> PAGEREF _Toc234413364 \h </w:instrText>
         </w:r>
         <w:r>
           <w:rPr>
@@ -2397,7 +2397,7 @@
           <w14:ligatures w14:val="standardContextual"/>
         </w:rPr>
       </w:pPr>
-      <w:hyperlink w:anchor="_Toc234178935" w:history="1">
+      <w:hyperlink w:anchor="_Toc234413365" w:history="1">
         <w:r>
           <w:rPr>
             <w:rStyle w:val="Hyperlink"/>
@@ -2424,7 +2424,7 @@
             <w:noProof/>
             <w:webHidden/>
           </w:rPr>
-          <w:instrText xml:space="preserve"> PAGEREF _Toc234178935 \h </w:instrText>
+          <w:instrText xml:space="preserve"> PAGEREF _Toc234413365 \h </w:instrText>
         </w:r>
         <w:r>
           <w:rPr>
@@ -2471,7 +2471,7 @@
           <w14:ligatures w14:val="standardContextual"/>
         </w:rPr>
       </w:pPr>
-      <w:hyperlink w:anchor="_Toc234178936" w:history="1">
+      <w:hyperlink w:anchor="_Toc234413366" w:history="1">
         <w:r>
           <w:rPr>
             <w:rStyle w:val="Hyperlink"/>
@@ -2498,7 +2498,7 @@
             <w:noProof/>
             <w:webHidden/>
           </w:rPr>
-          <w:instrText xml:space="preserve"> PAGEREF _Toc234178936 \h </w:instrText>
+          <w:instrText xml:space="preserve"> PAGEREF _Toc234413366 \h </w:instrText>
         </w:r>
         <w:r>
           <w:rPr>
@@ -2545,7 +2545,7 @@
           <w14:ligatures w14:val="standardContextual"/>
         </w:rPr>
       </w:pPr>
-      <w:hyperlink w:anchor="_Toc234178937" w:history="1">
+      <w:hyperlink w:anchor="_Toc234413367" w:history="1">
         <w:r>
           <w:rPr>
             <w:rStyle w:val="Hyperlink"/>
@@ -2572,7 +2572,7 @@
             <w:noProof/>
             <w:webHidden/>
           </w:rPr>
-          <w:instrText xml:space="preserve"> PAGEREF _Toc234178937 \h </w:instrText>
+          <w:instrText xml:space="preserve"> PAGEREF _Toc234413367 \h </w:instrText>
         </w:r>
         <w:r>
           <w:rPr>
@@ -2619,7 +2619,7 @@
           <w14:ligatures w14:val="standardContextual"/>
         </w:rPr>
       </w:pPr>
-      <w:hyperlink w:anchor="_Toc234178938" w:history="1">
+      <w:hyperlink w:anchor="_Toc234413368" w:history="1">
         <w:r>
           <w:rPr>
             <w:rStyle w:val="Hyperlink"/>
@@ -2646,7 +2646,7 @@
             <w:noProof/>
             <w:webHidden/>
           </w:rPr>
-          <w:instrText xml:space="preserve"> PAGEREF _Toc234178938 \h </w:instrText>
+          <w:instrText xml:space="preserve"> PAGEREF _Toc234413368 \h </w:instrText>
         </w:r>
         <w:r>
           <w:rPr>
@@ -2693,7 +2693,7 @@
           <w14:ligatures w14:val="standardContextual"/>
         </w:rPr>
       </w:pPr>
-      <w:hyperlink w:anchor="_Toc234178939" w:history="1">
+      <w:hyperlink w:anchor="_Toc234413369" w:history="1">
         <w:r>
           <w:rPr>
             <w:rStyle w:val="Hyperlink"/>
@@ -2720,7 +2720,7 @@
             <w:noProof/>
             <w:webHidden/>
           </w:rPr>
-          <w:instrText xml:space="preserve"> PAGEREF _Toc234178939 \h </w:instrText>
+          <w:instrText xml:space="preserve"> PAGEREF _Toc234413369 \h </w:instrText>
         </w:r>
         <w:r>
           <w:rPr>
@@ -2767,7 +2767,7 @@
           <w14:ligatures w14:val="standardContextual"/>
         </w:rPr>
       </w:pPr>
-      <w:hyperlink w:anchor="_Toc234178940" w:history="1">
+      <w:hyperlink w:anchor="_Toc234413370" w:history="1">
         <w:r>
           <w:rPr>
             <w:rStyle w:val="Hyperlink"/>
@@ -2794,7 +2794,7 @@
             <w:noProof/>
             <w:webHidden/>
           </w:rPr>
-          <w:instrText xml:space="preserve"> PAGEREF _Toc234178940 \h </w:instrText>
+          <w:instrText xml:space="preserve"> PAGEREF _Toc234413370 \h </w:instrText>
         </w:r>
         <w:r>
           <w:rPr>
@@ -2841,7 +2841,7 @@
           <w14:ligatures w14:val="standardContextual"/>
         </w:rPr>
       </w:pPr>
-      <w:hyperlink w:anchor="_Toc234178941" w:history="1">
+      <w:hyperlink w:anchor="_Toc234413371" w:history="1">
         <w:r>
           <w:rPr>
             <w:rStyle w:val="Hyperlink"/>
@@ -2868,7 +2868,7 @@
             <w:noProof/>
             <w:webHidden/>
           </w:rPr>
-          <w:instrText xml:space="preserve"> PAGEREF _Toc234178941 \h </w:instrText>
+          <w:instrText xml:space="preserve"> PAGEREF _Toc234413371 \h </w:instrText>
         </w:r>
         <w:r>
           <w:rPr>
@@ -2915,7 +2915,7 @@
           <w14:ligatures w14:val="standardContextual"/>
         </w:rPr>
       </w:pPr>
-      <w:hyperlink w:anchor="_Toc234178942" w:history="1">
+      <w:hyperlink w:anchor="_Toc234413372" w:history="1">
         <w:r>
           <w:rPr>
             <w:rStyle w:val="Hyperlink"/>
@@ -2942,7 +2942,7 @@
             <w:noProof/>
             <w:webHidden/>
           </w:rPr>
-          <w:instrText xml:space="preserve"> PAGEREF _Toc234178942 \h </w:instrText>
+          <w:instrText xml:space="preserve"> PAGEREF _Toc234413372 \h </w:instrText>
         </w:r>
         <w:r>
           <w:rPr>
@@ -2989,7 +2989,7 @@
           <w14:ligatures w14:val="standardContextual"/>
         </w:rPr>
       </w:pPr>
-      <w:hyperlink w:anchor="_Toc234178943" w:history="1">
+      <w:hyperlink w:anchor="_Toc234413373" w:history="1">
         <w:r>
           <w:rPr>
             <w:rStyle w:val="Hyperlink"/>
@@ -3016,7 +3016,7 @@
             <w:noProof/>
             <w:webHidden/>
           </w:rPr>
-          <w:instrText xml:space="preserve"> PAGEREF _Toc234178943 \h </w:instrText>
+          <w:instrText xml:space="preserve"> PAGEREF _Toc234413373 \h </w:instrText>
         </w:r>
         <w:r>
           <w:rPr>
@@ -3063,7 +3063,7 @@
           <w14:ligatures w14:val="standardContextual"/>
         </w:rPr>
       </w:pPr>
-      <w:hyperlink w:anchor="_Toc234178944" w:history="1">
+      <w:hyperlink w:anchor="_Toc234413374" w:history="1">
         <w:r>
           <w:rPr>
             <w:rStyle w:val="Hyperlink"/>
@@ -3090,7 +3090,7 @@
             <w:noProof/>
             <w:webHidden/>
           </w:rPr>
-          <w:instrText xml:space="preserve"> PAGEREF _Toc234178944 \h </w:instrText>
+          <w:instrText xml:space="preserve"> PAGEREF _Toc234413374 \h </w:instrText>
         </w:r>
         <w:r>
           <w:rPr>
@@ -3137,7 +3137,7 @@
           <w14:ligatures w14:val="standardContextual"/>
         </w:rPr>
       </w:pPr>
-      <w:hyperlink w:anchor="_Toc234178945" w:history="1">
+      <w:hyperlink w:anchor="_Toc234413375" w:history="1">
         <w:r>
           <w:rPr>
             <w:rStyle w:val="Hyperlink"/>
@@ -3164,7 +3164,7 @@
             <w:noProof/>
             <w:webHidden/>
           </w:rPr>
-          <w:instrText xml:space="preserve"> PAGEREF _Toc234178945 \h </w:instrText>
+          <w:instrText xml:space="preserve"> PAGEREF _Toc234413375 \h </w:instrText>
         </w:r>
         <w:r>
           <w:rPr>
@@ -3211,7 +3211,7 @@
           <w14:ligatures w14:val="standardContextual"/>
         </w:rPr>
       </w:pPr>
-      <w:hyperlink w:anchor="_Toc234178946" w:history="1">
+      <w:hyperlink w:anchor="_Toc234413376" w:history="1">
         <w:r>
           <w:rPr>
             <w:rStyle w:val="Hyperlink"/>
@@ -3238,7 +3238,7 @@
             <w:noProof/>
             <w:webHidden/>
           </w:rPr>
-          <w:instrText xml:space="preserve"> PAGEREF _Toc234178946 \h </w:instrText>
+          <w:instrText xml:space="preserve"> PAGEREF _Toc234413376 \h </w:instrText>
         </w:r>
         <w:r>
           <w:rPr>
@@ -3285,7 +3285,7 @@
           <w14:ligatures w14:val="standardContextual"/>
         </w:rPr>
       </w:pPr>
-      <w:hyperlink w:anchor="_Toc234178947" w:history="1">
+      <w:hyperlink w:anchor="_Toc234413377" w:history="1">
         <w:r>
           <w:rPr>
             <w:rStyle w:val="Hyperlink"/>
@@ -3312,7 +3312,7 @@
             <w:noProof/>
             <w:webHidden/>
           </w:rPr>
-          <w:instrText xml:space="preserve"> PAGEREF _Toc234178947 \h </w:instrText>
+          <w:instrText xml:space="preserve"> PAGEREF _Toc234413377 \h </w:instrText>
         </w:r>
         <w:r>
           <w:rPr>
@@ -3359,7 +3359,7 @@
           <w14:ligatures w14:val="standardContextual"/>
         </w:rPr>
       </w:pPr>
-      <w:hyperlink w:anchor="_Toc234178948" w:history="1">
+      <w:hyperlink w:anchor="_Toc234413378" w:history="1">
         <w:r>
           <w:rPr>
             <w:rStyle w:val="Hyperlink"/>
@@ -3386,7 +3386,7 @@
             <w:noProof/>
             <w:webHidden/>
           </w:rPr>
-          <w:instrText xml:space="preserve"> PAGEREF _Toc234178948 \h </w:instrText>
+          <w:instrText xml:space="preserve"> PAGEREF _Toc234413378 \h </w:instrText>
         </w:r>
         <w:r>
           <w:rPr>
@@ -3433,7 +3433,7 @@
           <w14:ligatures w14:val="standardContextual"/>
         </w:rPr>
       </w:pPr>
-      <w:hyperlink w:anchor="_Toc234178949" w:history="1">
+      <w:hyperlink w:anchor="_Toc234413379" w:history="1">
         <w:r>
           <w:rPr>
             <w:rStyle w:val="Hyperlink"/>
@@ -3460,7 +3460,7 @@
             <w:noProof/>
             <w:webHidden/>
           </w:rPr>
-          <w:instrText xml:space="preserve"> PAGEREF _Toc234178949 \h </w:instrText>
+          <w:instrText xml:space="preserve"> PAGEREF _Toc234413379 \h </w:instrText>
         </w:r>
         <w:r>
           <w:rPr>
@@ -3507,7 +3507,7 @@
           <w14:ligatures w14:val="standardContextual"/>
         </w:rPr>
       </w:pPr>
-      <w:hyperlink w:anchor="_Toc234178950" w:history="1">
+      <w:hyperlink w:anchor="_Toc234413380" w:history="1">
         <w:r>
           <w:rPr>
             <w:rStyle w:val="Hyperlink"/>
@@ -3534,7 +3534,7 @@
             <w:noProof/>
             <w:webHidden/>
           </w:rPr>
-          <w:instrText xml:space="preserve"> PAGEREF _Toc234178950 \h </w:instrText>
+          <w:instrText xml:space="preserve"> PAGEREF _Toc234413380 \h </w:instrText>
         </w:r>
         <w:r>
           <w:rPr>
@@ -3581,7 +3581,7 @@
           <w14:ligatures w14:val="standardContextual"/>
         </w:rPr>
       </w:pPr>
-      <w:hyperlink w:anchor="_Toc234178951" w:history="1">
+      <w:hyperlink w:anchor="_Toc234413381" w:history="1">
         <w:r>
           <w:rPr>
             <w:rStyle w:val="Hyperlink"/>
@@ -3608,7 +3608,7 @@
             <w:noProof/>
             <w:webHidden/>
           </w:rPr>
-          <w:instrText xml:space="preserve"> PAGEREF _Toc234178951 \h </w:instrText>
+          <w:instrText xml:space="preserve"> PAGEREF _Toc234413381 \h </w:instrText>
         </w:r>
         <w:r>
           <w:rPr>
@@ -3655,7 +3655,7 @@
           <w14:ligatures w14:val="standardContextual"/>
         </w:rPr>
       </w:pPr>
-      <w:hyperlink w:anchor="_Toc234178952" w:history="1">
+      <w:hyperlink w:anchor="_Toc234413382" w:history="1">
         <w:r>
           <w:rPr>
             <w:rStyle w:val="Hyperlink"/>
@@ -3682,7 +3682,7 @@
             <w:noProof/>
             <w:webHidden/>
           </w:rPr>
-          <w:instrText xml:space="preserve"> PAGEREF _Toc234178952 \h </w:instrText>
+          <w:instrText xml:space="preserve"> PAGEREF _Toc234413382 \h </w:instrText>
         </w:r>
         <w:r>
           <w:rPr>
@@ -3729,7 +3729,7 @@
           <w14:ligatures w14:val="standardContextual"/>
         </w:rPr>
       </w:pPr>
-      <w:hyperlink w:anchor="_Toc234178953" w:history="1">
+      <w:hyperlink w:anchor="_Toc234413383" w:history="1">
         <w:r>
           <w:rPr>
             <w:rStyle w:val="Hyperlink"/>
@@ -3756,7 +3756,7 @@
             <w:noProof/>
             <w:webHidden/>
           </w:rPr>
-          <w:instrText xml:space="preserve"> PAGEREF _Toc234178953 \h </w:instrText>
+          <w:instrText xml:space="preserve"> PAGEREF _Toc234413383 \h </w:instrText>
         </w:r>
         <w:r>
           <w:rPr>
@@ -3803,7 +3803,7 @@
           <w14:ligatures w14:val="standardContextual"/>
         </w:rPr>
       </w:pPr>
-      <w:hyperlink w:anchor="_Toc234178954" w:history="1">
+      <w:hyperlink w:anchor="_Toc234413384" w:history="1">
         <w:r>
           <w:rPr>
             <w:rStyle w:val="Hyperlink"/>
@@ -3830,7 +3830,7 @@
             <w:noProof/>
             <w:webHidden/>
           </w:rPr>
-          <w:instrText xml:space="preserve"> PAGEREF _Toc234178954 \h </w:instrText>
+          <w:instrText xml:space="preserve"> PAGEREF _Toc234413384 \h </w:instrText>
         </w:r>
         <w:r>
           <w:rPr>
@@ -3877,7 +3877,7 @@
           <w14:ligatures w14:val="standardContextual"/>
         </w:rPr>
       </w:pPr>
-      <w:hyperlink w:anchor="_Toc234178955" w:history="1">
+      <w:hyperlink w:anchor="_Toc234413385" w:history="1">
         <w:r>
           <w:rPr>
             <w:rStyle w:val="Hyperlink"/>
@@ -3904,7 +3904,7 @@
             <w:noProof/>
             <w:webHidden/>
           </w:rPr>
-          <w:instrText xml:space="preserve"> PAGEREF _Toc234178955 \h </w:instrText>
+          <w:instrText xml:space="preserve"> PAGEREF _Toc234413385 \h </w:instrText>
         </w:r>
         <w:r>
           <w:rPr>
@@ -3951,7 +3951,7 @@
           <w14:ligatures w14:val="standardContextual"/>
         </w:rPr>
       </w:pPr>
-      <w:hyperlink w:anchor="_Toc234178956" w:history="1">
+      <w:hyperlink w:anchor="_Toc234413386" w:history="1">
         <w:r>
           <w:rPr>
             <w:rStyle w:val="Hyperlink"/>
@@ -3978,7 +3978,7 @@
             <w:noProof/>
             <w:webHidden/>
           </w:rPr>
-          <w:instrText xml:space="preserve"> PAGEREF _Toc234178956 \h </w:instrText>
+          <w:instrText xml:space="preserve"> PAGEREF _Toc234413386 \h </w:instrText>
         </w:r>
         <w:r>
           <w:rPr>
@@ -4025,7 +4025,7 @@
           <w14:ligatures w14:val="standardContextual"/>
         </w:rPr>
       </w:pPr>
-      <w:hyperlink w:anchor="_Toc234178957" w:history="1">
+      <w:hyperlink w:anchor="_Toc234413387" w:history="1">
         <w:r>
           <w:rPr>
             <w:rStyle w:val="Hyperlink"/>
@@ -4052,7 +4052,7 @@
             <w:noProof/>
             <w:webHidden/>
           </w:rPr>
-          <w:instrText xml:space="preserve"> PAGEREF _Toc234178957 \h </w:instrText>
+          <w:instrText xml:space="preserve"> PAGEREF _Toc234413387 \h </w:instrText>
         </w:r>
         <w:r>
           <w:rPr>
@@ -4099,7 +4099,7 @@
           <w14:ligatures w14:val="standardContextual"/>
         </w:rPr>
       </w:pPr>
-      <w:hyperlink w:anchor="_Toc234178958" w:history="1">
+      <w:hyperlink w:anchor="_Toc234413388" w:history="1">
         <w:r>
           <w:rPr>
             <w:rStyle w:val="Hyperlink"/>
@@ -4126,7 +4126,7 @@
             <w:noProof/>
             <w:webHidden/>
           </w:rPr>
-          <w:instrText xml:space="preserve"> PAGEREF _Toc234178958 \h </w:instrText>
+          <w:instrText xml:space="preserve"> PAGEREF _Toc234413388 \h </w:instrText>
         </w:r>
         <w:r>
           <w:rPr>
@@ -4174,7 +4174,7 @@
       <w:pPr>
         <w:pStyle w:val="Heading2"/>
       </w:pPr>
-      <w:bookmarkStart w:id="2" w:name="_Toc234178912"/>
+      <w:bookmarkStart w:id="2" w:name="_Toc234413342"/>
       <w:r>
         <w:lastRenderedPageBreak/>
         <w:t>Document Map</w:t>
@@ -5438,7 +5438,7 @@
       <w:pPr>
         <w:pStyle w:val="Heading2"/>
       </w:pPr>
-      <w:bookmarkStart w:id="3" w:name="_Toc234178913"/>
+      <w:bookmarkStart w:id="3" w:name="_Toc234413343"/>
       <w:r>
         <w:t>Detailed Section Index</w:t>
       </w:r>
@@ -6597,7 +6597,7 @@
       <w:pPr>
         <w:pStyle w:val="Heading2"/>
       </w:pPr>
-      <w:bookmarkStart w:id="4" w:name="_Toc234178914"/>
+      <w:bookmarkStart w:id="4" w:name="_Toc234413344"/>
       <w:r>
         <w:t>List of Figures</w:t>
       </w:r>
@@ -7903,14 +7903,8 @@
             <w:vAlign w:val="center"/>
           </w:tcPr>
           <w:p>
-            <w:pPr>
-              <w:spacing w:after="0"/>
-            </w:pPr>
-            <w:r>
-              <w:rPr>
-                <w:sz w:val="18"/>
-              </w:rPr>
-              <w:t>UI Wireframe Mockups</w:t>
+            <w:r>
+              <w:t>UI Wireframes</w:t>
             </w:r>
           </w:p>
         </w:tc>
@@ -8220,7 +8214,7 @@
       <w:pPr>
         <w:pStyle w:val="Heading2"/>
       </w:pPr>
-      <w:bookmarkStart w:id="5" w:name="_Toc234178915"/>
+      <w:bookmarkStart w:id="5" w:name="_Toc234413345"/>
       <w:r>
         <w:lastRenderedPageBreak/>
         <w:t>List of Key Tables</w:t>
@@ -8994,7 +8988,7 @@
       <w:pPr>
         <w:pStyle w:val="Heading2"/>
       </w:pPr>
-      <w:bookmarkStart w:id="6" w:name="_Toc234178916"/>
+      <w:bookmarkStart w:id="6" w:name="_Toc234413346"/>
       <w:r>
         <w:t>Reader Path</w:t>
       </w:r>
@@ -9352,7 +9346,7 @@
       <w:pPr>
         <w:pStyle w:val="Heading1"/>
       </w:pPr>
-      <w:bookmarkStart w:id="7" w:name="_Toc234178917"/>
+      <w:bookmarkStart w:id="7" w:name="_Toc234413347"/>
       <w:r>
         <w:lastRenderedPageBreak/>
         <w:t>1. Project Planning &amp; Management</w:t>
@@ -9368,7 +9362,7 @@
       <w:pPr>
         <w:pStyle w:val="Heading2"/>
       </w:pPr>
-      <w:bookmarkStart w:id="8" w:name="_Toc234178918"/>
+      <w:bookmarkStart w:id="8" w:name="_Toc234413348"/>
       <w:r>
         <w:t>1.1 Project Proposal</w:t>
       </w:r>
@@ -9788,7 +9782,7 @@
       <w:pPr>
         <w:pStyle w:val="Heading2"/>
       </w:pPr>
-      <w:bookmarkStart w:id="9" w:name="_Toc234178919"/>
+      <w:bookmarkStart w:id="9" w:name="_Toc234413349"/>
       <w:r>
         <w:lastRenderedPageBreak/>
         <w:t>1.2 Project Plan</w:t>
@@ -11360,7 +11354,7 @@
               <w:rPr>
                 <w:sz w:val="18"/>
               </w:rPr>
-              <w:t>Visual Studio Code/Codex workspace, Git/GitHub, Python, Node.js, Docker.</w:t>
+              <w:t>Visual Studio Code, Git/GitHub, Python, Node.js, Docker.</w:t>
             </w:r>
           </w:p>
         </w:tc>
@@ -11615,7 +11609,7 @@
       <w:pPr>
         <w:pStyle w:val="Heading2"/>
       </w:pPr>
-      <w:bookmarkStart w:id="10" w:name="_Toc234178920"/>
+      <w:bookmarkStart w:id="10" w:name="_Toc234413350"/>
       <w:r>
         <w:t>1.3 Task Assignment &amp; Roles</w:t>
       </w:r>
@@ -12211,7 +12205,7 @@
       <w:pPr>
         <w:pStyle w:val="Heading2"/>
       </w:pPr>
-      <w:bookmarkStart w:id="11" w:name="_Toc234178921"/>
+      <w:bookmarkStart w:id="11" w:name="_Toc234413351"/>
       <w:r>
         <w:t>1.4 Risk Assessment &amp; Mitigation Plan</w:t>
       </w:r>
@@ -12893,7 +12887,7 @@
       <w:pPr>
         <w:pStyle w:val="Heading2"/>
       </w:pPr>
-      <w:bookmarkStart w:id="12" w:name="_Toc234178922"/>
+      <w:bookmarkStart w:id="12" w:name="_Toc234413352"/>
       <w:r>
         <w:t>1.5 KPIs</w:t>
       </w:r>
@@ -13591,7 +13585,7 @@
       <w:pPr>
         <w:pStyle w:val="Heading1"/>
       </w:pPr>
-      <w:bookmarkStart w:id="13" w:name="_Toc234178923"/>
+      <w:bookmarkStart w:id="13" w:name="_Toc234413353"/>
       <w:r>
         <w:lastRenderedPageBreak/>
         <w:t>2. Literature Review</w:t>
@@ -14056,7 +14050,7 @@
       <w:pPr>
         <w:pStyle w:val="Heading2"/>
       </w:pPr>
-      <w:bookmarkStart w:id="14" w:name="_Toc234178924"/>
+      <w:bookmarkStart w:id="14" w:name="_Toc234413354"/>
       <w:r>
         <w:t>2.1 Feedback &amp; Evaluation</w:t>
       </w:r>
@@ -14082,7 +14076,7 @@
         <w:pStyle w:val="ListBullet"/>
       </w:pPr>
       <w:r>
-        <w:t>The project should be evaluated as a working full-stack application rather than a static mockup.</w:t>
+        <w:t>The project should be evaluated as a working full-stack application with real authentication, analysis, reporting, feedback, and administration workflows.</w:t>
       </w:r>
     </w:p>
     <w:p>
@@ -14113,7 +14107,7 @@
       <w:pPr>
         <w:pStyle w:val="Heading2"/>
       </w:pPr>
-      <w:bookmarkStart w:id="15" w:name="_Toc234178925"/>
+      <w:bookmarkStart w:id="15" w:name="_Toc234413355"/>
       <w:r>
         <w:t>2.2 Suggested Improvements</w:t>
       </w:r>
@@ -14155,6 +14149,7 @@
         <w:pStyle w:val="ListBullet"/>
       </w:pPr>
       <w:r>
+        <w:lastRenderedPageBreak/>
         <w:t>Improve .msg parsing with a hardened parser and more malicious file samples.</w:t>
       </w:r>
     </w:p>
@@ -14163,7 +14158,6 @@
         <w:pStyle w:val="ListBullet"/>
       </w:pPr>
       <w:r>
-        <w:lastRenderedPageBreak/>
         <w:t>Move rate limiting to Redis for scalable multi-instance deployment.</w:t>
       </w:r>
     </w:p>
@@ -14179,7 +14173,7 @@
       <w:pPr>
         <w:pStyle w:val="Heading2"/>
       </w:pPr>
-      <w:bookmarkStart w:id="16" w:name="_Toc234178926"/>
+      <w:bookmarkStart w:id="16" w:name="_Toc234413356"/>
       <w:r>
         <w:t>2.3 Final Grading Criteria</w:t>
       </w:r>
@@ -14780,7 +14774,7 @@
       <w:pPr>
         <w:pStyle w:val="Heading1"/>
       </w:pPr>
-      <w:bookmarkStart w:id="17" w:name="_Toc234178927"/>
+      <w:bookmarkStart w:id="17" w:name="_Toc234413357"/>
       <w:r>
         <w:lastRenderedPageBreak/>
         <w:t>3. Requirements Gathering</w:t>
@@ -14796,7 +14790,7 @@
       <w:pPr>
         <w:pStyle w:val="Heading2"/>
       </w:pPr>
-      <w:bookmarkStart w:id="18" w:name="_Toc234178928"/>
+      <w:bookmarkStart w:id="18" w:name="_Toc234413358"/>
       <w:r>
         <w:t>3.1 Stakeholder Analysis</w:t>
       </w:r>
@@ -15392,7 +15386,7 @@
       <w:pPr>
         <w:pStyle w:val="Heading2"/>
       </w:pPr>
-      <w:bookmarkStart w:id="19" w:name="_Toc234178929"/>
+      <w:bookmarkStart w:id="19" w:name="_Toc234413359"/>
       <w:r>
         <w:lastRenderedPageBreak/>
         <w:t>3.2 User Stories &amp; Use Cases</w:t>
@@ -16051,7 +16045,7 @@
       <w:pPr>
         <w:pStyle w:val="Heading2"/>
       </w:pPr>
-      <w:bookmarkStart w:id="20" w:name="_Toc234178930"/>
+      <w:bookmarkStart w:id="20" w:name="_Toc234413360"/>
       <w:r>
         <w:lastRenderedPageBreak/>
         <w:t>3.3 Functional Requirements</w:t>
@@ -16927,7 +16921,7 @@
       <w:pPr>
         <w:pStyle w:val="Heading2"/>
       </w:pPr>
-      <w:bookmarkStart w:id="21" w:name="_Toc234178931"/>
+      <w:bookmarkStart w:id="21" w:name="_Toc234413361"/>
       <w:r>
         <w:t>3.4 Non-Functional Requirements</w:t>
       </w:r>
@@ -17409,7 +17403,7 @@
       <w:pPr>
         <w:pStyle w:val="Heading1"/>
       </w:pPr>
-      <w:bookmarkStart w:id="22" w:name="_Toc234178932"/>
+      <w:bookmarkStart w:id="22" w:name="_Toc234413362"/>
       <w:r>
         <w:lastRenderedPageBreak/>
         <w:t>4. System Analysis &amp; Design</w:t>
@@ -17425,7 +17419,7 @@
       <w:pPr>
         <w:pStyle w:val="Heading2"/>
       </w:pPr>
-      <w:bookmarkStart w:id="23" w:name="_Toc234178933"/>
+      <w:bookmarkStart w:id="23" w:name="_Toc234413363"/>
       <w:r>
         <w:t>4.1 Problem Statement &amp; Objectives</w:t>
       </w:r>
@@ -17487,7 +17481,7 @@
       <w:pPr>
         <w:pStyle w:val="Heading2"/>
       </w:pPr>
-      <w:bookmarkStart w:id="24" w:name="_Toc234178934"/>
+      <w:bookmarkStart w:id="24" w:name="_Toc234413364"/>
       <w:r>
         <w:t>4.2 Use Case Diagram &amp; Descriptions</w:t>
       </w:r>
@@ -17517,7 +17511,7 @@
       <w:pPr>
         <w:pStyle w:val="Heading2"/>
       </w:pPr>
-      <w:bookmarkStart w:id="25" w:name="_Toc234178935"/>
+      <w:bookmarkStart w:id="25" w:name="_Toc234413365"/>
       <w:r>
         <w:t>4.3 Functional &amp; Non-Functional Requirements</w:t>
       </w:r>
@@ -17547,7 +17541,7 @@
       <w:pPr>
         <w:pStyle w:val="Heading2"/>
       </w:pPr>
-      <w:bookmarkStart w:id="26" w:name="_Toc234178936"/>
+      <w:bookmarkStart w:id="26" w:name="_Toc234413366"/>
       <w:r>
         <w:lastRenderedPageBreak/>
         <w:t>4.4 Software Architecture</w:t>
@@ -17639,7 +17633,7 @@
       <w:pPr>
         <w:pStyle w:val="Heading2"/>
       </w:pPr>
-      <w:bookmarkStart w:id="27" w:name="_Toc234178937"/>
+      <w:bookmarkStart w:id="27" w:name="_Toc234413367"/>
       <w:r>
         <w:lastRenderedPageBreak/>
         <w:t>4.5 Database Design &amp; Data Modeling</w:t>
@@ -18945,7 +18939,7 @@
       <w:pPr>
         <w:pStyle w:val="Heading2"/>
       </w:pPr>
-      <w:bookmarkStart w:id="28" w:name="_Toc234178938"/>
+      <w:bookmarkStart w:id="28" w:name="_Toc234413368"/>
       <w:r>
         <w:lastRenderedPageBreak/>
         <w:t>4.6 Data Flow &amp; System Behavior</w:t>
@@ -19670,7 +19664,7 @@
       <w:pPr>
         <w:pStyle w:val="Heading2"/>
       </w:pPr>
-      <w:bookmarkStart w:id="29" w:name="_Toc234178939"/>
+      <w:bookmarkStart w:id="29" w:name="_Toc234413369"/>
       <w:r>
         <w:t>4.7 UI/UX Design &amp; Prototyping</w:t>
       </w:r>
@@ -19749,7 +19743,7 @@
           <w:color w:val="5B677A"/>
           <w:sz w:val="18"/>
         </w:rPr>
-        <w:t>Figure 10. Wireframe mockups for major PhishGuard screens.</w:t>
+        <w:t>Figure 10. Wireframes for major PhishGuard screens.</w:t>
       </w:r>
     </w:p>
     <w:tbl>
@@ -20216,7 +20210,7 @@
       <w:pPr>
         <w:pStyle w:val="Heading2"/>
       </w:pPr>
-      <w:bookmarkStart w:id="30" w:name="_Toc234178940"/>
+      <w:bookmarkStart w:id="30" w:name="_Toc234413370"/>
       <w:r>
         <w:t>4.8 System Deployment &amp; Integration</w:t>
       </w:r>
@@ -20755,7 +20749,7 @@
       <w:pPr>
         <w:pStyle w:val="Heading2"/>
       </w:pPr>
-      <w:bookmarkStart w:id="31" w:name="_Toc234178941"/>
+      <w:bookmarkStart w:id="31" w:name="_Toc234413371"/>
       <w:r>
         <w:t>4.9 Additional Deliverables</w:t>
       </w:r>
@@ -21262,7 +21256,7 @@
       <w:pPr>
         <w:pStyle w:val="Heading1"/>
       </w:pPr>
-      <w:bookmarkStart w:id="32" w:name="_Toc234178942"/>
+      <w:bookmarkStart w:id="32" w:name="_Toc234413372"/>
       <w:r>
         <w:lastRenderedPageBreak/>
         <w:t>5. Implementation: Source Code &amp; Execution</w:t>
@@ -21271,14 +21265,14 @@
     </w:p>
     <w:p>
       <w:r>
-        <w:t>The implementation is organized as a full-stack project rather than a sample screen. The frontend, backend, database layer, analyzers, reports, authentication, administration, and model workflow are separated so the system can be tested, maintained, and extended.</w:t>
+        <w:t>The implementation is organized as a full-stack project rather than a isolated screen. The frontend, backend, database layer, analyzers, reports, authentication, administration, and model workflow are separated so the system can be tested, maintained, and extended.</w:t>
       </w:r>
     </w:p>
     <w:p>
       <w:pPr>
         <w:pStyle w:val="Heading2"/>
       </w:pPr>
-      <w:bookmarkStart w:id="33" w:name="_Toc234178943"/>
+      <w:bookmarkStart w:id="33" w:name="_Toc234413373"/>
       <w:r>
         <w:t>5.1 Source Code</w:t>
       </w:r>
@@ -21755,7 +21749,7 @@
       <w:pPr>
         <w:pStyle w:val="Heading2"/>
       </w:pPr>
-      <w:bookmarkStart w:id="34" w:name="_Toc234178944"/>
+      <w:bookmarkStart w:id="34" w:name="_Toc234413374"/>
       <w:r>
         <w:t>5.2 Version Control &amp; Collaboration</w:t>
       </w:r>
@@ -22178,7 +22172,7 @@
       <w:pPr>
         <w:pStyle w:val="Heading2"/>
       </w:pPr>
-      <w:bookmarkStart w:id="35" w:name="_Toc234178945"/>
+      <w:bookmarkStart w:id="35" w:name="_Toc234413375"/>
       <w:r>
         <w:t>5.3 Deployment &amp; Execution</w:t>
       </w:r>
@@ -22658,7 +22652,7 @@
       <w:pPr>
         <w:pStyle w:val="Heading1"/>
       </w:pPr>
-      <w:bookmarkStart w:id="36" w:name="_Toc234178946"/>
+      <w:bookmarkStart w:id="36" w:name="_Toc234413376"/>
       <w:r>
         <w:lastRenderedPageBreak/>
         <w:t>6. Testing &amp; Quality Assurance</w:t>
@@ -22667,14 +22661,14 @@
     </w:p>
     <w:p>
       <w:r>
-        <w:t>Testing focuses on the flows that prove the application is real and usable: account creation, login, URL analysis, email analysis, report display, export, feedback, access control, and administrator actions. The test plan combines expected manual outcomes with automated checks.</w:t>
+        <w:t>Testing focuses on the flows that prove the application is real and usable: account creation, login, URL analysis, email analysis, report display, export, feedback, access control, owner-safe history, and administrator actions. The test plan combines expected manual outcomes with automated checks.</w:t>
       </w:r>
     </w:p>
     <w:p>
       <w:pPr>
         <w:pStyle w:val="Heading2"/>
       </w:pPr>
-      <w:bookmarkStart w:id="37" w:name="_Toc234178947"/>
+      <w:bookmarkStart w:id="37" w:name="_Toc234413377"/>
       <w:r>
         <w:t>6.1 Test Cases &amp; Test Plan</w:t>
       </w:r>
@@ -23721,7 +23715,7 @@
       <w:pPr>
         <w:pStyle w:val="Heading2"/>
       </w:pPr>
-      <w:bookmarkStart w:id="38" w:name="_Toc234178948"/>
+      <w:bookmarkStart w:id="38" w:name="_Toc234413378"/>
       <w:r>
         <w:t>6.2 Automated Testing</w:t>
       </w:r>
@@ -23739,7 +23733,7 @@
           <w:color w:val="5B677A"/>
           <w:sz w:val="21"/>
         </w:rPr>
-        <w:t>Automated checks protect the most important backend, frontend, build, and browser behaviors.</w:t>
+        <w:t>Automated checks currently include 20 passing backend pytest tests, 7 passing frontend unit tests, a passing frontend lint run, a successful production build, and browser smoke coverage for login, analysis, result, and admin flows. One browser case remains intentionally skipped in the suite.</w:t>
       </w:r>
     </w:p>
     <w:tbl>
@@ -23874,14 +23868,12 @@
             <w:vAlign w:val="center"/>
           </w:tcPr>
           <w:p>
-            <w:pPr>
-              <w:spacing w:after="0"/>
-            </w:pPr>
-            <w:r>
-              <w:rPr>
-                <w:sz w:val="18"/>
-              </w:rPr>
-              <w:t>Auth, analysis persistence, .eml upload, report generation, analyzers, URL probe blocking, admin access, feedback, model status.</w:t>
+            <w:r>
+              <w:t xml:space="preserve">20 passing pytest tests covering authentication, analysis persistence, uploads, reports, feedback, admin access, model status, and owner-safe </w:t>
+            </w:r>
+            <w:r>
+              <w:lastRenderedPageBreak/>
+              <w:t>history.</w:t>
             </w:r>
           </w:p>
         </w:tc>
@@ -23913,6 +23905,7 @@
               <w:rPr>
                 <w:sz w:val="18"/>
               </w:rPr>
+              <w:lastRenderedPageBreak/>
               <w:t>Frontend tests</w:t>
             </w:r>
           </w:p>
@@ -23935,14 +23928,8 @@
             <w:vAlign w:val="center"/>
           </w:tcPr>
           <w:p>
-            <w:pPr>
-              <w:spacing w:after="0"/>
-            </w:pPr>
-            <w:r>
-              <w:rPr>
-                <w:sz w:val="18"/>
-              </w:rPr>
-              <w:t>Risk gauge formatting and accessible meter rendering.</w:t>
+            <w:r>
+              <w:t>7 passing unit tests covering risk gauge formatting and accessible meter rendering.</w:t>
             </w:r>
           </w:p>
         </w:tc>
@@ -23974,7 +23961,6 @@
               <w:rPr>
                 <w:sz w:val="18"/>
               </w:rPr>
-              <w:lastRenderedPageBreak/>
               <w:t>Lint/build checks</w:t>
             </w:r>
           </w:p>
@@ -23997,14 +23983,8 @@
             <w:vAlign w:val="center"/>
           </w:tcPr>
           <w:p>
-            <w:pPr>
-              <w:spacing w:after="0"/>
-            </w:pPr>
-            <w:r>
-              <w:rPr>
-                <w:sz w:val="18"/>
-              </w:rPr>
-              <w:t>ESLint and Next.js build verify frontend code quality and production readiness.</w:t>
+            <w:r>
+              <w:t>ESLint and the Next.js production build pass successfully.</w:t>
             </w:r>
           </w:p>
         </w:tc>
@@ -24057,14 +24037,8 @@
             <w:vAlign w:val="center"/>
           </w:tcPr>
           <w:p>
-            <w:pPr>
-              <w:spacing w:after="0"/>
-            </w:pPr>
-            <w:r>
-              <w:rPr>
-                <w:sz w:val="18"/>
-              </w:rPr>
-              <w:t>Admin login, URL report, phishing report, and readable detail panels.</w:t>
+            <w:r>
+              <w:t>5 browser smoke checks passed; 1 case is intentionally skipped in the suite.</w:t>
             </w:r>
           </w:p>
         </w:tc>
@@ -24075,7 +24049,7 @@
       <w:pPr>
         <w:pStyle w:val="Heading2"/>
       </w:pPr>
-      <w:bookmarkStart w:id="39" w:name="_Toc234178949"/>
+      <w:bookmarkStart w:id="39" w:name="_Toc234413379"/>
       <w:r>
         <w:t>6.3 Bug Reports</w:t>
       </w:r>
@@ -24540,6 +24514,72 @@
           </w:p>
         </w:tc>
       </w:tr>
+      <w:tr>
+        <w:tc>
+          <w:tcPr>
+            <w:tcW w:w="3312" w:type="dxa"/>
+          </w:tcPr>
+          <w:p>
+            <w:r>
+              <w:t>Feedback from regular users was not clear in admin review.</w:t>
+            </w:r>
+          </w:p>
+        </w:tc>
+        <w:tc>
+          <w:tcPr>
+            <w:tcW w:w="6048" w:type="dxa"/>
+          </w:tcPr>
+          <w:p>
+            <w:r>
+              <w:t>Admin Feedback Queue now shows submitter identity, pending state, manual refresh, and periodic refresh.</w:t>
+            </w:r>
+          </w:p>
+        </w:tc>
+      </w:tr>
+      <w:tr>
+        <w:tc>
+          <w:tcPr>
+            <w:tcW w:w="3312" w:type="dxa"/>
+          </w:tcPr>
+          <w:p>
+            <w:r>
+              <w:t>Admin review displayed the current admin as the analyst for user-created records.</w:t>
+            </w:r>
+          </w:p>
+        </w:tc>
+        <w:tc>
+          <w:tcPr>
+            <w:tcW w:w="6048" w:type="dxa"/>
+          </w:tcPr>
+          <w:p>
+            <w:r>
+              <w:t>Analysis list responses now include original owner fields, and History/CSV exports display the real analyst.</w:t>
+            </w:r>
+          </w:p>
+        </w:tc>
+      </w:tr>
+      <w:tr>
+        <w:tc>
+          <w:tcPr>
+            <w:tcW w:w="3312" w:type="dxa"/>
+          </w:tcPr>
+          <w:p>
+            <w:r>
+              <w:t>Correct feedback needed a consistent dataset label.</w:t>
+            </w:r>
+          </w:p>
+        </w:tc>
+        <w:tc>
+          <w:tcPr>
+            <w:tcW w:w="6048" w:type="dxa"/>
+          </w:tcPr>
+          <w:p>
+            <w:r>
+              <w:t>Correct-result feedback is normalized from the analysis classification before approval into the verified dataset.</w:t>
+            </w:r>
+          </w:p>
+        </w:tc>
+      </w:tr>
     </w:tbl>
     <w:p/>
     <w:p>
@@ -24551,7 +24591,7 @@
       <w:pPr>
         <w:pStyle w:val="Heading1"/>
       </w:pPr>
-      <w:bookmarkStart w:id="40" w:name="_Toc234178950"/>
+      <w:bookmarkStart w:id="40" w:name="_Toc234413380"/>
       <w:r>
         <w:lastRenderedPageBreak/>
         <w:t>7. Final Presentation &amp; Reports</w:t>
@@ -24567,7 +24607,7 @@
       <w:pPr>
         <w:pStyle w:val="Heading2"/>
       </w:pPr>
-      <w:bookmarkStart w:id="41" w:name="_Toc234178951"/>
+      <w:bookmarkStart w:id="41" w:name="_Toc234413381"/>
       <w:r>
         <w:t>7.1 User Manual</w:t>
       </w:r>
@@ -24656,7 +24696,7 @@
       <w:pPr>
         <w:pStyle w:val="Heading2"/>
       </w:pPr>
-      <w:bookmarkStart w:id="42" w:name="_Toc234178952"/>
+      <w:bookmarkStart w:id="42" w:name="_Toc234413382"/>
       <w:r>
         <w:t>7.2 Technical Documentation</w:t>
       </w:r>
@@ -24713,7 +24753,7 @@
       <w:pPr>
         <w:pStyle w:val="Heading2"/>
       </w:pPr>
-      <w:bookmarkStart w:id="43" w:name="_Toc234178953"/>
+      <w:bookmarkStart w:id="43" w:name="_Toc234413383"/>
       <w:r>
         <w:t>7.3 Project Presentation</w:t>
       </w:r>
@@ -24822,29 +24862,9 @@
         <w:tc>
           <w:tcPr>
             <w:tcW w:w="1152" w:type="dxa"/>
-            <w:tcBorders>
-              <w:top w:val="single" w:sz="6" w:space="0" w:color="D7DEE8"/>
-              <w:left w:val="single" w:sz="6" w:space="0" w:color="D7DEE8"/>
-              <w:bottom w:val="single" w:sz="6" w:space="0" w:color="D7DEE8"/>
-              <w:right w:val="single" w:sz="6" w:space="0" w:color="D7DEE8"/>
-            </w:tcBorders>
-            <w:tcMar>
-              <w:top w:w="100" w:type="dxa"/>
-              <w:left w:w="140" w:type="dxa"/>
-              <w:bottom w:w="100" w:type="dxa"/>
-              <w:right w:w="140" w:type="dxa"/>
-            </w:tcMar>
-            <w:vAlign w:val="center"/>
-          </w:tcPr>
-          <w:p>
-            <w:pPr>
-              <w:spacing w:after="0"/>
-              <w:jc w:val="center"/>
-            </w:pPr>
-            <w:r>
-              <w:rPr>
-                <w:sz w:val="18"/>
-              </w:rPr>
+          </w:tcPr>
+          <w:p>
+            <w:r>
               <w:t>1</w:t>
             </w:r>
           </w:p>
@@ -24852,29 +24872,10 @@
         <w:tc>
           <w:tcPr>
             <w:tcW w:w="8208" w:type="dxa"/>
-            <w:tcBorders>
-              <w:top w:val="single" w:sz="6" w:space="0" w:color="D7DEE8"/>
-              <w:left w:val="single" w:sz="6" w:space="0" w:color="D7DEE8"/>
-              <w:bottom w:val="single" w:sz="6" w:space="0" w:color="D7DEE8"/>
-              <w:right w:val="single" w:sz="6" w:space="0" w:color="D7DEE8"/>
-            </w:tcBorders>
-            <w:tcMar>
-              <w:top w:w="100" w:type="dxa"/>
-              <w:left w:w="140" w:type="dxa"/>
-              <w:bottom w:w="100" w:type="dxa"/>
-              <w:right w:w="140" w:type="dxa"/>
-            </w:tcMar>
-            <w:vAlign w:val="center"/>
-          </w:tcPr>
-          <w:p>
-            <w:pPr>
-              <w:spacing w:after="0"/>
-            </w:pPr>
-            <w:r>
-              <w:rPr>
-                <w:sz w:val="18"/>
-              </w:rPr>
-              <w:t>Project title, team, and problem statement.</w:t>
+          </w:tcPr>
+          <w:p>
+            <w:r>
+              <w:t>Title, project purpose, and active model status.</w:t>
             </w:r>
           </w:p>
         </w:tc>
@@ -24883,29 +24884,9 @@
         <w:tc>
           <w:tcPr>
             <w:tcW w:w="1152" w:type="dxa"/>
-            <w:tcBorders>
-              <w:top w:val="single" w:sz="6" w:space="0" w:color="D7DEE8"/>
-              <w:left w:val="single" w:sz="6" w:space="0" w:color="D7DEE8"/>
-              <w:bottom w:val="single" w:sz="6" w:space="0" w:color="D7DEE8"/>
-              <w:right w:val="single" w:sz="6" w:space="0" w:color="D7DEE8"/>
-            </w:tcBorders>
-            <w:tcMar>
-              <w:top w:w="100" w:type="dxa"/>
-              <w:left w:w="140" w:type="dxa"/>
-              <w:bottom w:w="100" w:type="dxa"/>
-              <w:right w:w="140" w:type="dxa"/>
-            </w:tcMar>
-            <w:vAlign w:val="center"/>
-          </w:tcPr>
-          <w:p>
-            <w:pPr>
-              <w:spacing w:after="0"/>
-              <w:jc w:val="center"/>
-            </w:pPr>
-            <w:r>
-              <w:rPr>
-                <w:sz w:val="18"/>
-              </w:rPr>
+          </w:tcPr>
+          <w:p>
+            <w:r>
               <w:t>2</w:t>
             </w:r>
           </w:p>
@@ -24913,29 +24894,10 @@
         <w:tc>
           <w:tcPr>
             <w:tcW w:w="8208" w:type="dxa"/>
-            <w:tcBorders>
-              <w:top w:val="single" w:sz="6" w:space="0" w:color="D7DEE8"/>
-              <w:left w:val="single" w:sz="6" w:space="0" w:color="D7DEE8"/>
-              <w:bottom w:val="single" w:sz="6" w:space="0" w:color="D7DEE8"/>
-              <w:right w:val="single" w:sz="6" w:space="0" w:color="D7DEE8"/>
-            </w:tcBorders>
-            <w:tcMar>
-              <w:top w:w="100" w:type="dxa"/>
-              <w:left w:w="140" w:type="dxa"/>
-              <w:bottom w:w="100" w:type="dxa"/>
-              <w:right w:w="140" w:type="dxa"/>
-            </w:tcMar>
-            <w:vAlign w:val="center"/>
-          </w:tcPr>
-          <w:p>
-            <w:pPr>
-              <w:spacing w:after="0"/>
-            </w:pPr>
-            <w:r>
-              <w:rPr>
-                <w:sz w:val="18"/>
-              </w:rPr>
-              <w:t>Objectives, scope, and stakeholders.</w:t>
+          </w:tcPr>
+          <w:p>
+            <w:r>
+              <w:t>Presentation roadmap and review path.</w:t>
             </w:r>
           </w:p>
         </w:tc>
@@ -24944,29 +24906,9 @@
         <w:tc>
           <w:tcPr>
             <w:tcW w:w="1152" w:type="dxa"/>
-            <w:tcBorders>
-              <w:top w:val="single" w:sz="6" w:space="0" w:color="D7DEE8"/>
-              <w:left w:val="single" w:sz="6" w:space="0" w:color="D7DEE8"/>
-              <w:bottom w:val="single" w:sz="6" w:space="0" w:color="D7DEE8"/>
-              <w:right w:val="single" w:sz="6" w:space="0" w:color="D7DEE8"/>
-            </w:tcBorders>
-            <w:tcMar>
-              <w:top w:w="100" w:type="dxa"/>
-              <w:left w:w="140" w:type="dxa"/>
-              <w:bottom w:w="100" w:type="dxa"/>
-              <w:right w:w="140" w:type="dxa"/>
-            </w:tcMar>
-            <w:vAlign w:val="center"/>
-          </w:tcPr>
-          <w:p>
-            <w:pPr>
-              <w:spacing w:after="0"/>
-              <w:jc w:val="center"/>
-            </w:pPr>
-            <w:r>
-              <w:rPr>
-                <w:sz w:val="18"/>
-              </w:rPr>
+          </w:tcPr>
+          <w:p>
+            <w:r>
               <w:t>3</w:t>
             </w:r>
           </w:p>
@@ -24974,29 +24916,10 @@
         <w:tc>
           <w:tcPr>
             <w:tcW w:w="8208" w:type="dxa"/>
-            <w:tcBorders>
-              <w:top w:val="single" w:sz="6" w:space="0" w:color="D7DEE8"/>
-              <w:left w:val="single" w:sz="6" w:space="0" w:color="D7DEE8"/>
-              <w:bottom w:val="single" w:sz="6" w:space="0" w:color="D7DEE8"/>
-              <w:right w:val="single" w:sz="6" w:space="0" w:color="D7DEE8"/>
-            </w:tcBorders>
-            <w:tcMar>
-              <w:top w:w="100" w:type="dxa"/>
-              <w:left w:w="140" w:type="dxa"/>
-              <w:bottom w:w="100" w:type="dxa"/>
-              <w:right w:w="140" w:type="dxa"/>
-            </w:tcMar>
-            <w:vAlign w:val="center"/>
-          </w:tcPr>
-          <w:p>
-            <w:pPr>
-              <w:spacing w:after="0"/>
-            </w:pPr>
-            <w:r>
-              <w:rPr>
-                <w:sz w:val="18"/>
-              </w:rPr>
-              <w:t>Requirements and use cases.</w:t>
+          </w:tcPr>
+          <w:p>
+            <w:r>
+              <w:t>Phishing problem and why evidence matters.</w:t>
             </w:r>
           </w:p>
         </w:tc>
@@ -25005,29 +24928,9 @@
         <w:tc>
           <w:tcPr>
             <w:tcW w:w="1152" w:type="dxa"/>
-            <w:tcBorders>
-              <w:top w:val="single" w:sz="6" w:space="0" w:color="D7DEE8"/>
-              <w:left w:val="single" w:sz="6" w:space="0" w:color="D7DEE8"/>
-              <w:bottom w:val="single" w:sz="6" w:space="0" w:color="D7DEE8"/>
-              <w:right w:val="single" w:sz="6" w:space="0" w:color="D7DEE8"/>
-            </w:tcBorders>
-            <w:tcMar>
-              <w:top w:w="100" w:type="dxa"/>
-              <w:left w:w="140" w:type="dxa"/>
-              <w:bottom w:w="100" w:type="dxa"/>
-              <w:right w:w="140" w:type="dxa"/>
-            </w:tcMar>
-            <w:vAlign w:val="center"/>
-          </w:tcPr>
-          <w:p>
-            <w:pPr>
-              <w:spacing w:after="0"/>
-              <w:jc w:val="center"/>
-            </w:pPr>
-            <w:r>
-              <w:rPr>
-                <w:sz w:val="18"/>
-              </w:rPr>
+          </w:tcPr>
+          <w:p>
+            <w:r>
               <w:t>4</w:t>
             </w:r>
           </w:p>
@@ -25035,29 +24938,10 @@
         <w:tc>
           <w:tcPr>
             <w:tcW w:w="8208" w:type="dxa"/>
-            <w:tcBorders>
-              <w:top w:val="single" w:sz="6" w:space="0" w:color="D7DEE8"/>
-              <w:left w:val="single" w:sz="6" w:space="0" w:color="D7DEE8"/>
-              <w:bottom w:val="single" w:sz="6" w:space="0" w:color="D7DEE8"/>
-              <w:right w:val="single" w:sz="6" w:space="0" w:color="D7DEE8"/>
-            </w:tcBorders>
-            <w:tcMar>
-              <w:top w:w="100" w:type="dxa"/>
-              <w:left w:w="140" w:type="dxa"/>
-              <w:bottom w:w="100" w:type="dxa"/>
-              <w:right w:w="140" w:type="dxa"/>
-            </w:tcMar>
-            <w:vAlign w:val="center"/>
-          </w:tcPr>
-          <w:p>
-            <w:pPr>
-              <w:spacing w:after="0"/>
-            </w:pPr>
-            <w:r>
-              <w:rPr>
-                <w:sz w:val="18"/>
-              </w:rPr>
-              <w:t>Architecture and technology stack.</w:t>
+          </w:tcPr>
+          <w:p>
+            <w:r>
+              <w:t>Analysis pipeline from raw input to verdict.</w:t>
             </w:r>
           </w:p>
         </w:tc>
@@ -25066,29 +24950,9 @@
         <w:tc>
           <w:tcPr>
             <w:tcW w:w="1152" w:type="dxa"/>
-            <w:tcBorders>
-              <w:top w:val="single" w:sz="6" w:space="0" w:color="D7DEE8"/>
-              <w:left w:val="single" w:sz="6" w:space="0" w:color="D7DEE8"/>
-              <w:bottom w:val="single" w:sz="6" w:space="0" w:color="D7DEE8"/>
-              <w:right w:val="single" w:sz="6" w:space="0" w:color="D7DEE8"/>
-            </w:tcBorders>
-            <w:tcMar>
-              <w:top w:w="100" w:type="dxa"/>
-              <w:left w:w="140" w:type="dxa"/>
-              <w:bottom w:w="100" w:type="dxa"/>
-              <w:right w:w="140" w:type="dxa"/>
-            </w:tcMar>
-            <w:vAlign w:val="center"/>
-          </w:tcPr>
-          <w:p>
-            <w:pPr>
-              <w:spacing w:after="0"/>
-              <w:jc w:val="center"/>
-            </w:pPr>
-            <w:r>
-              <w:rPr>
-                <w:sz w:val="18"/>
-              </w:rPr>
+          </w:tcPr>
+          <w:p>
+            <w:r>
               <w:t>5</w:t>
             </w:r>
           </w:p>
@@ -25096,29 +24960,10 @@
         <w:tc>
           <w:tcPr>
             <w:tcW w:w="8208" w:type="dxa"/>
-            <w:tcBorders>
-              <w:top w:val="single" w:sz="6" w:space="0" w:color="D7DEE8"/>
-              <w:left w:val="single" w:sz="6" w:space="0" w:color="D7DEE8"/>
-              <w:bottom w:val="single" w:sz="6" w:space="0" w:color="D7DEE8"/>
-              <w:right w:val="single" w:sz="6" w:space="0" w:color="D7DEE8"/>
-            </w:tcBorders>
-            <w:tcMar>
-              <w:top w:w="100" w:type="dxa"/>
-              <w:left w:w="140" w:type="dxa"/>
-              <w:bottom w:w="100" w:type="dxa"/>
-              <w:right w:w="140" w:type="dxa"/>
-            </w:tcMar>
-            <w:vAlign w:val="center"/>
-          </w:tcPr>
-          <w:p>
-            <w:pPr>
-              <w:spacing w:after="0"/>
-            </w:pPr>
-            <w:r>
-              <w:rPr>
-                <w:sz w:val="18"/>
-              </w:rPr>
-              <w:t>URL safety checking and safe parsing.</w:t>
+          </w:tcPr>
+          <w:p>
+            <w:r>
+              <w:t>Controlled workflow from login to report.</w:t>
             </w:r>
           </w:p>
         </w:tc>
@@ -25127,29 +24972,9 @@
         <w:tc>
           <w:tcPr>
             <w:tcW w:w="1152" w:type="dxa"/>
-            <w:tcBorders>
-              <w:top w:val="single" w:sz="6" w:space="0" w:color="D7DEE8"/>
-              <w:left w:val="single" w:sz="6" w:space="0" w:color="D7DEE8"/>
-              <w:bottom w:val="single" w:sz="6" w:space="0" w:color="D7DEE8"/>
-              <w:right w:val="single" w:sz="6" w:space="0" w:color="D7DEE8"/>
-            </w:tcBorders>
-            <w:tcMar>
-              <w:top w:w="100" w:type="dxa"/>
-              <w:left w:w="140" w:type="dxa"/>
-              <w:bottom w:w="100" w:type="dxa"/>
-              <w:right w:w="140" w:type="dxa"/>
-            </w:tcMar>
-            <w:vAlign w:val="center"/>
-          </w:tcPr>
-          <w:p>
-            <w:pPr>
-              <w:spacing w:after="0"/>
-              <w:jc w:val="center"/>
-            </w:pPr>
-            <w:r>
-              <w:rPr>
-                <w:sz w:val="18"/>
-              </w:rPr>
+          </w:tcPr>
+          <w:p>
+            <w:r>
               <w:t>6</w:t>
             </w:r>
           </w:p>
@@ -25157,29 +24982,10 @@
         <w:tc>
           <w:tcPr>
             <w:tcW w:w="8208" w:type="dxa"/>
-            <w:tcBorders>
-              <w:top w:val="single" w:sz="6" w:space="0" w:color="D7DEE8"/>
-              <w:left w:val="single" w:sz="6" w:space="0" w:color="D7DEE8"/>
-              <w:bottom w:val="single" w:sz="6" w:space="0" w:color="D7DEE8"/>
-              <w:right w:val="single" w:sz="6" w:space="0" w:color="D7DEE8"/>
-            </w:tcBorders>
-            <w:tcMar>
-              <w:top w:w="100" w:type="dxa"/>
-              <w:left w:w="140" w:type="dxa"/>
-              <w:bottom w:w="100" w:type="dxa"/>
-              <w:right w:w="140" w:type="dxa"/>
-            </w:tcMar>
-            <w:vAlign w:val="center"/>
-          </w:tcPr>
-          <w:p>
-            <w:pPr>
-              <w:spacing w:after="0"/>
-            </w:pPr>
-            <w:r>
-              <w:rPr>
-                <w:sz w:val="18"/>
-              </w:rPr>
-              <w:t>Database design and ML governance.</w:t>
+          </w:tcPr>
+          <w:p>
+            <w:r>
+              <w:t>Architecture and technology stack.</w:t>
             </w:r>
           </w:p>
         </w:tc>
@@ -25188,29 +24994,9 @@
         <w:tc>
           <w:tcPr>
             <w:tcW w:w="1152" w:type="dxa"/>
-            <w:tcBorders>
-              <w:top w:val="single" w:sz="6" w:space="0" w:color="D7DEE8"/>
-              <w:left w:val="single" w:sz="6" w:space="0" w:color="D7DEE8"/>
-              <w:bottom w:val="single" w:sz="6" w:space="0" w:color="D7DEE8"/>
-              <w:right w:val="single" w:sz="6" w:space="0" w:color="D7DEE8"/>
-            </w:tcBorders>
-            <w:tcMar>
-              <w:top w:w="100" w:type="dxa"/>
-              <w:left w:w="140" w:type="dxa"/>
-              <w:bottom w:w="100" w:type="dxa"/>
-              <w:right w:w="140" w:type="dxa"/>
-            </w:tcMar>
-            <w:vAlign w:val="center"/>
-          </w:tcPr>
-          <w:p>
-            <w:pPr>
-              <w:spacing w:after="0"/>
-              <w:jc w:val="center"/>
-            </w:pPr>
-            <w:r>
-              <w:rPr>
-                <w:sz w:val="18"/>
-              </w:rPr>
+          </w:tcPr>
+          <w:p>
+            <w:r>
               <w:lastRenderedPageBreak/>
               <w:t>7</w:t>
             </w:r>
@@ -25219,29 +25005,10 @@
         <w:tc>
           <w:tcPr>
             <w:tcW w:w="8208" w:type="dxa"/>
-            <w:tcBorders>
-              <w:top w:val="single" w:sz="6" w:space="0" w:color="D7DEE8"/>
-              <w:left w:val="single" w:sz="6" w:space="0" w:color="D7DEE8"/>
-              <w:bottom w:val="single" w:sz="6" w:space="0" w:color="D7DEE8"/>
-              <w:right w:val="single" w:sz="6" w:space="0" w:color="D7DEE8"/>
-            </w:tcBorders>
-            <w:tcMar>
-              <w:top w:w="100" w:type="dxa"/>
-              <w:left w:w="140" w:type="dxa"/>
-              <w:bottom w:w="100" w:type="dxa"/>
-              <w:right w:w="140" w:type="dxa"/>
-            </w:tcMar>
-            <w:vAlign w:val="center"/>
-          </w:tcPr>
-          <w:p>
-            <w:pPr>
-              <w:spacing w:after="0"/>
-            </w:pPr>
-            <w:r>
-              <w:rPr>
-                <w:sz w:val="18"/>
-              </w:rPr>
-              <w:t>Execution walkthrough: register, analyze URL, analyze email, export report.</w:t>
+          </w:tcPr>
+          <w:p>
+            <w:r>
+              <w:t>URL safety checking and guarded probing.</w:t>
             </w:r>
           </w:p>
         </w:tc>
@@ -25250,29 +25017,9 @@
         <w:tc>
           <w:tcPr>
             <w:tcW w:w="1152" w:type="dxa"/>
-            <w:tcBorders>
-              <w:top w:val="single" w:sz="6" w:space="0" w:color="D7DEE8"/>
-              <w:left w:val="single" w:sz="6" w:space="0" w:color="D7DEE8"/>
-              <w:bottom w:val="single" w:sz="6" w:space="0" w:color="D7DEE8"/>
-              <w:right w:val="single" w:sz="6" w:space="0" w:color="D7DEE8"/>
-            </w:tcBorders>
-            <w:tcMar>
-              <w:top w:w="100" w:type="dxa"/>
-              <w:left w:w="140" w:type="dxa"/>
-              <w:bottom w:w="100" w:type="dxa"/>
-              <w:right w:w="140" w:type="dxa"/>
-            </w:tcMar>
-            <w:vAlign w:val="center"/>
-          </w:tcPr>
-          <w:p>
-            <w:pPr>
-              <w:spacing w:after="0"/>
-              <w:jc w:val="center"/>
-            </w:pPr>
-            <w:r>
-              <w:rPr>
-                <w:sz w:val="18"/>
-              </w:rPr>
+          </w:tcPr>
+          <w:p>
+            <w:r>
               <w:t>8</w:t>
             </w:r>
           </w:p>
@@ -25280,29 +25027,10 @@
         <w:tc>
           <w:tcPr>
             <w:tcW w:w="8208" w:type="dxa"/>
-            <w:tcBorders>
-              <w:top w:val="single" w:sz="6" w:space="0" w:color="D7DEE8"/>
-              <w:left w:val="single" w:sz="6" w:space="0" w:color="D7DEE8"/>
-              <w:bottom w:val="single" w:sz="6" w:space="0" w:color="D7DEE8"/>
-              <w:right w:val="single" w:sz="6" w:space="0" w:color="D7DEE8"/>
-            </w:tcBorders>
-            <w:tcMar>
-              <w:top w:w="100" w:type="dxa"/>
-              <w:left w:w="140" w:type="dxa"/>
-              <w:bottom w:w="100" w:type="dxa"/>
-              <w:right w:w="140" w:type="dxa"/>
-            </w:tcMar>
-            <w:vAlign w:val="center"/>
-          </w:tcPr>
-          <w:p>
-            <w:pPr>
-              <w:spacing w:after="0"/>
-            </w:pPr>
-            <w:r>
-              <w:rPr>
-                <w:sz w:val="18"/>
-              </w:rPr>
-              <w:t>Admin authorization and feedback review.</w:t>
+          </w:tcPr>
+          <w:p>
+            <w:r>
+              <w:t>NLP and machine learning contribution.</w:t>
             </w:r>
           </w:p>
         </w:tc>
@@ -25311,29 +25039,9 @@
         <w:tc>
           <w:tcPr>
             <w:tcW w:w="1152" w:type="dxa"/>
-            <w:tcBorders>
-              <w:top w:val="single" w:sz="6" w:space="0" w:color="D7DEE8"/>
-              <w:left w:val="single" w:sz="6" w:space="0" w:color="D7DEE8"/>
-              <w:bottom w:val="single" w:sz="6" w:space="0" w:color="D7DEE8"/>
-              <w:right w:val="single" w:sz="6" w:space="0" w:color="D7DEE8"/>
-            </w:tcBorders>
-            <w:tcMar>
-              <w:top w:w="100" w:type="dxa"/>
-              <w:left w:w="140" w:type="dxa"/>
-              <w:bottom w:w="100" w:type="dxa"/>
-              <w:right w:w="140" w:type="dxa"/>
-            </w:tcMar>
-            <w:vAlign w:val="center"/>
-          </w:tcPr>
-          <w:p>
-            <w:pPr>
-              <w:spacing w:after="0"/>
-              <w:jc w:val="center"/>
-            </w:pPr>
-            <w:r>
-              <w:rPr>
-                <w:sz w:val="18"/>
-              </w:rPr>
+          </w:tcPr>
+          <w:p>
+            <w:r>
               <w:t>9</w:t>
             </w:r>
           </w:p>
@@ -25341,29 +25049,10 @@
         <w:tc>
           <w:tcPr>
             <w:tcW w:w="8208" w:type="dxa"/>
-            <w:tcBorders>
-              <w:top w:val="single" w:sz="6" w:space="0" w:color="D7DEE8"/>
-              <w:left w:val="single" w:sz="6" w:space="0" w:color="D7DEE8"/>
-              <w:bottom w:val="single" w:sz="6" w:space="0" w:color="D7DEE8"/>
-              <w:right w:val="single" w:sz="6" w:space="0" w:color="D7DEE8"/>
-            </w:tcBorders>
-            <w:tcMar>
-              <w:top w:w="100" w:type="dxa"/>
-              <w:left w:w="140" w:type="dxa"/>
-              <w:bottom w:w="100" w:type="dxa"/>
-              <w:right w:w="140" w:type="dxa"/>
-            </w:tcMar>
-            <w:vAlign w:val="center"/>
-          </w:tcPr>
-          <w:p>
-            <w:pPr>
-              <w:spacing w:after="0"/>
-            </w:pPr>
-            <w:r>
-              <w:rPr>
-                <w:sz w:val="18"/>
-              </w:rPr>
-              <w:t>Testing, bug fixes, and quality assurance.</w:t>
+          </w:tcPr>
+          <w:p>
+            <w:r>
+              <w:t>Explainable result page and exports.</w:t>
             </w:r>
           </w:p>
         </w:tc>
@@ -25372,29 +25061,9 @@
         <w:tc>
           <w:tcPr>
             <w:tcW w:w="1152" w:type="dxa"/>
-            <w:tcBorders>
-              <w:top w:val="single" w:sz="6" w:space="0" w:color="D7DEE8"/>
-              <w:left w:val="single" w:sz="6" w:space="0" w:color="D7DEE8"/>
-              <w:bottom w:val="single" w:sz="6" w:space="0" w:color="D7DEE8"/>
-              <w:right w:val="single" w:sz="6" w:space="0" w:color="D7DEE8"/>
-            </w:tcBorders>
-            <w:tcMar>
-              <w:top w:w="100" w:type="dxa"/>
-              <w:left w:w="140" w:type="dxa"/>
-              <w:bottom w:w="100" w:type="dxa"/>
-              <w:right w:w="140" w:type="dxa"/>
-            </w:tcMar>
-            <w:vAlign w:val="center"/>
-          </w:tcPr>
-          <w:p>
-            <w:pPr>
-              <w:spacing w:after="0"/>
-              <w:jc w:val="center"/>
-            </w:pPr>
-            <w:r>
-              <w:rPr>
-                <w:sz w:val="18"/>
-              </w:rPr>
+          </w:tcPr>
+          <w:p>
+            <w:r>
               <w:t>10</w:t>
             </w:r>
           </w:p>
@@ -25402,29 +25071,76 @@
         <w:tc>
           <w:tcPr>
             <w:tcW w:w="8208" w:type="dxa"/>
-            <w:tcBorders>
-              <w:top w:val="single" w:sz="6" w:space="0" w:color="D7DEE8"/>
-              <w:left w:val="single" w:sz="6" w:space="0" w:color="D7DEE8"/>
-              <w:bottom w:val="single" w:sz="6" w:space="0" w:color="D7DEE8"/>
-              <w:right w:val="single" w:sz="6" w:space="0" w:color="D7DEE8"/>
-            </w:tcBorders>
-            <w:tcMar>
-              <w:top w:w="100" w:type="dxa"/>
-              <w:left w:w="140" w:type="dxa"/>
-              <w:bottom w:w="100" w:type="dxa"/>
-              <w:right w:w="140" w:type="dxa"/>
-            </w:tcMar>
-            <w:vAlign w:val="center"/>
-          </w:tcPr>
-          <w:p>
-            <w:pPr>
-              <w:spacing w:after="0"/>
-            </w:pPr>
-            <w:r>
-              <w:rPr>
-                <w:sz w:val="18"/>
-              </w:rPr>
-              <w:t>Conclusion, limitations, and future improvements.</w:t>
+          </w:tcPr>
+          <w:p>
+            <w:r>
+              <w:t>Admin controls, feedback review, and user governance.</w:t>
+            </w:r>
+          </w:p>
+        </w:tc>
+      </w:tr>
+      <w:tr>
+        <w:tc>
+          <w:tcPr>
+            <w:tcW w:w="1152" w:type="dxa"/>
+          </w:tcPr>
+          <w:p>
+            <w:r>
+              <w:t>11</w:t>
+            </w:r>
+          </w:p>
+        </w:tc>
+        <w:tc>
+          <w:tcPr>
+            <w:tcW w:w="8208" w:type="dxa"/>
+          </w:tcPr>
+          <w:p>
+            <w:r>
+              <w:t>Database traceability and stored evidence.</w:t>
+            </w:r>
+          </w:p>
+        </w:tc>
+      </w:tr>
+      <w:tr>
+        <w:tc>
+          <w:tcPr>
+            <w:tcW w:w="1152" w:type="dxa"/>
+          </w:tcPr>
+          <w:p>
+            <w:r>
+              <w:t>12</w:t>
+            </w:r>
+          </w:p>
+        </w:tc>
+        <w:tc>
+          <w:tcPr>
+            <w:tcW w:w="8208" w:type="dxa"/>
+          </w:tcPr>
+          <w:p>
+            <w:r>
+              <w:t>Latest testing and quality-assurance evidence.</w:t>
+            </w:r>
+          </w:p>
+        </w:tc>
+      </w:tr>
+      <w:tr>
+        <w:tc>
+          <w:tcPr>
+            <w:tcW w:w="1152" w:type="dxa"/>
+          </w:tcPr>
+          <w:p>
+            <w:r>
+              <w:t>13</w:t>
+            </w:r>
+          </w:p>
+        </w:tc>
+        <w:tc>
+          <w:tcPr>
+            <w:tcW w:w="8208" w:type="dxa"/>
+          </w:tcPr>
+          <w:p>
+            <w:r>
+              <w:t>Readiness, limitations, and future improvements.</w:t>
             </w:r>
           </w:p>
         </w:tc>
@@ -25435,7 +25151,7 @@
       <w:pPr>
         <w:pStyle w:val="Heading2"/>
       </w:pPr>
-      <w:bookmarkStart w:id="44" w:name="_Toc234178954"/>
+      <w:bookmarkStart w:id="44" w:name="_Toc234413384"/>
       <w:r>
         <w:t>7.4 Video Walkthrough</w:t>
       </w:r>
@@ -25529,7 +25245,7 @@
       <w:pPr>
         <w:pStyle w:val="Heading1"/>
       </w:pPr>
-      <w:bookmarkStart w:id="45" w:name="_Toc234178955"/>
+      <w:bookmarkStart w:id="45" w:name="_Toc234413385"/>
       <w:r>
         <w:lastRenderedPageBreak/>
         <w:t>Appendix A. Technical Reference</w:t>
@@ -25545,7 +25261,7 @@
       <w:pPr>
         <w:pStyle w:val="Heading2"/>
       </w:pPr>
-      <w:bookmarkStart w:id="46" w:name="_Toc234178956"/>
+      <w:bookmarkStart w:id="46" w:name="_Toc234413386"/>
       <w:r>
         <w:t>A.1 Hybrid Scoring</w:t>
       </w:r>
@@ -26809,7 +26525,7 @@
       <w:pPr>
         <w:pStyle w:val="Heading2"/>
       </w:pPr>
-      <w:bookmarkStart w:id="47" w:name="_Toc234178957"/>
+      <w:bookmarkStart w:id="47" w:name="_Toc234413387"/>
       <w:r>
         <w:t>A.2 Environment Variables</w:t>
       </w:r>
@@ -27406,7 +27122,7 @@
       <w:pPr>
         <w:pStyle w:val="Heading2"/>
       </w:pPr>
-      <w:bookmarkStart w:id="48" w:name="_Toc234178958"/>
+      <w:bookmarkStart w:id="48" w:name="_Toc234413388"/>
       <w:r>
         <w:t>A.3 References</w:t>
       </w:r>
@@ -27468,10 +27184,12 @@
       </w:r>
     </w:p>
     <w:sectPr>
-      <w:headerReference w:type="default" r:id="rId20"/>
-      <w:footerReference w:type="even" r:id="rId21"/>
-      <w:footerReference w:type="default" r:id="rId22"/>
-      <w:footerReference w:type="first" r:id="rId23"/>
+      <w:headerReference w:type="even" r:id="rId20"/>
+      <w:headerReference w:type="default" r:id="rId21"/>
+      <w:footerReference w:type="even" r:id="rId22"/>
+      <w:footerReference w:type="default" r:id="rId23"/>
+      <w:headerReference w:type="first" r:id="rId24"/>
+      <w:footerReference w:type="first" r:id="rId25"/>
       <w:pgSz w:w="12240" w:h="15840"/>
       <w:pgMar w:top="1440" w:right="1440" w:bottom="1440" w:left="1440" w:header="708" w:footer="708" w:gutter="0"/>
       <w:cols w:space="720"/>
@@ -27821,6 +27539,16 @@
   <w:p>
     <w:pPr>
       <w:pStyle w:val="Header"/>
+    </w:pPr>
+  </w:p>
+</w:hdr>
+</file>
+
+<file path=word/header2.xml><?xml version="1.0" encoding="utf-8"?>
+<w:hdr xmlns:wpc="http://schemas.microsoft.com/office/word/2010/wordprocessingCanvas" xmlns:cx="http://schemas.microsoft.com/office/drawing/2014/chartex" xmlns:cx1="http://schemas.microsoft.com/office/drawing/2015/9/8/chartex" xmlns:cx2="http://schemas.microsoft.com/office/drawing/2015/10/21/chartex" xmlns:cx3="http://schemas.microsoft.com/office/drawing/2016/5/9/chartex" xmlns:cx4="http://schemas.microsoft.com/office/drawing/2016/5/10/chartex" xmlns:cx5="http://schemas.microsoft.com/office/drawing/2016/5/11/chartex" xmlns:cx6="http://schemas.microsoft.com/office/drawing/2016/5/12/chartex" xmlns:cx7="http://schemas.microsoft.com/office/drawing/2016/5/13/chartex" xmlns:cx8="http://schemas.microsoft.com/office/drawing/2016/5/14/chartex" xmlns:mc="http://schemas.openxmlformats.org/markup-compatibility/2006" xmlns:aink="http://schemas.microsoft.com/office/drawing/2016/ink" xmlns:am3d="http://schemas.microsoft.com/office/drawing/2017/model3d" xmlns:o="urn:schemas-microsoft-com:office:office" xmlns:oel="http://schemas.microsoft.com/office/2019/extlst" xmlns:r="http://schemas.openxmlformats.org/officeDocument/2006/relationships" xmlns:m="http://schemas.openxmlformats.org/officeDocument/2006/math" xmlns:v="urn:schemas-microsoft-com:vml" xmlns:wp14="http://schemas.microsoft.com/office/word/2010/wordprocessingDrawing" xmlns:wp="http://schemas.openxmlformats.org/drawingml/2006/wordprocessingDrawing" xmlns:w10="urn:schemas-microsoft-com:office:word" xmlns:w="http://schemas.openxmlformats.org/wordprocessingml/2006/main" xmlns:w14="http://schemas.microsoft.com/office/word/2010/wordml" xmlns:w15="http://schemas.microsoft.com/office/word/2012/wordml" xmlns:w16cex="http://schemas.microsoft.com/office/word/2018/wordml/cex" xmlns:w16cid="http://schemas.microsoft.com/office/word/2016/wordml/cid" xmlns:w16="http://schemas.microsoft.com/office/word/2018/wordml" xmlns:w16du="http://schemas.microsoft.com/office/word/2023/wordml/word16du" xmlns:w16sdtdh="http://schemas.microsoft.com/office/word/2020/wordml/sdtdatahash" xmlns:w16sdtfl="http://schemas.microsoft.com/office/word/2024/wordml/sdtformatlock" xmlns:w16se="http://schemas.microsoft.com/office/word/2015/wordml/symex" xmlns:wpg="http://schemas.microsoft.com/office/word/2010/wordprocessingGroup" xmlns:wpi="http://schemas.microsoft.com/office/word/2010/wordprocessingInk" xmlns:wne="http://schemas.microsoft.com/office/word/2006/wordml" xmlns:wps="http://schemas.microsoft.com/office/word/2010/wordprocessingShape" mc:Ignorable="w14 w15 w16se w16cid w16 w16cex w16sdtdh w16sdtfl w16du wp14">
+  <w:p>
+    <w:pPr>
+      <w:pStyle w:val="Header"/>
       <w:jc w:val="right"/>
     </w:pPr>
     <w:r>
@@ -27830,6 +27558,16 @@
       </w:rPr>
       <w:t>PhishGuard Academic Project Documentation</w:t>
     </w:r>
+  </w:p>
+</w:hdr>
+</file>
+
+<file path=word/header3.xml><?xml version="1.0" encoding="utf-8"?>
+<w:hdr xmlns:wpc="http://schemas.microsoft.com/office/word/2010/wordprocessingCanvas" xmlns:cx="http://schemas.microsoft.com/office/drawing/2014/chartex" xmlns:cx1="http://schemas.microsoft.com/office/drawing/2015/9/8/chartex" xmlns:cx2="http://schemas.microsoft.com/office/drawing/2015/10/21/chartex" xmlns:cx3="http://schemas.microsoft.com/office/drawing/2016/5/9/chartex" xmlns:cx4="http://schemas.microsoft.com/office/drawing/2016/5/10/chartex" xmlns:cx5="http://schemas.microsoft.com/office/drawing/2016/5/11/chartex" xmlns:cx6="http://schemas.microsoft.com/office/drawing/2016/5/12/chartex" xmlns:cx7="http://schemas.microsoft.com/office/drawing/2016/5/13/chartex" xmlns:cx8="http://schemas.microsoft.com/office/drawing/2016/5/14/chartex" xmlns:mc="http://schemas.openxmlformats.org/markup-compatibility/2006" xmlns:aink="http://schemas.microsoft.com/office/drawing/2016/ink" xmlns:am3d="http://schemas.microsoft.com/office/drawing/2017/model3d" xmlns:o="urn:schemas-microsoft-com:office:office" xmlns:oel="http://schemas.microsoft.com/office/2019/extlst" xmlns:r="http://schemas.openxmlformats.org/officeDocument/2006/relationships" xmlns:m="http://schemas.openxmlformats.org/officeDocument/2006/math" xmlns:v="urn:schemas-microsoft-com:vml" xmlns:wp14="http://schemas.microsoft.com/office/word/2010/wordprocessingDrawing" xmlns:wp="http://schemas.openxmlformats.org/drawingml/2006/wordprocessingDrawing" xmlns:w10="urn:schemas-microsoft-com:office:word" xmlns:w="http://schemas.openxmlformats.org/wordprocessingml/2006/main" xmlns:w14="http://schemas.microsoft.com/office/word/2010/wordml" xmlns:w15="http://schemas.microsoft.com/office/word/2012/wordml" xmlns:w16cex="http://schemas.microsoft.com/office/word/2018/wordml/cex" xmlns:w16cid="http://schemas.microsoft.com/office/word/2016/wordml/cid" xmlns:w16="http://schemas.microsoft.com/office/word/2018/wordml" xmlns:w16du="http://schemas.microsoft.com/office/word/2023/wordml/word16du" xmlns:w16sdtdh="http://schemas.microsoft.com/office/word/2020/wordml/sdtdatahash" xmlns:w16sdtfl="http://schemas.microsoft.com/office/word/2024/wordml/sdtformatlock" xmlns:w16se="http://schemas.microsoft.com/office/word/2015/wordml/symex" xmlns:wpg="http://schemas.microsoft.com/office/word/2010/wordprocessingGroup" xmlns:wpi="http://schemas.microsoft.com/office/word/2010/wordprocessingInk" xmlns:wne="http://schemas.microsoft.com/office/word/2006/wordml" xmlns:wps="http://schemas.microsoft.com/office/word/2010/wordprocessingShape" mc:Ignorable="w14 w15 w16se w16cid w16 w16cex w16sdtdh w16sdtfl w16du wp14">
+  <w:p>
+    <w:pPr>
+      <w:pStyle w:val="Header"/>
+    </w:pPr>
   </w:p>
 </w:hdr>
 </file>

</xml_diff>